<commit_message>
--CAPNHAT-- - Chinh sua nhe file word bao cao - Cap nhat Readme.md (dep hon, day du hon)
</commit_message>
<xml_diff>
--- a/LAB_AT_OOSD/LAB06/word/PhamMinhGiang-12DHCNPM1-1250080044.docx
+++ b/LAB_AT_OOSD/LAB06/word/PhamMinhGiang-12DHCNPM1-1250080044.docx
@@ -5923,7 +5923,13 @@
         <w:rPr>
           <w:noProof/>
         </w:rPr>
-        <w:t>1. Use case chi tiết từ đăng ký khám đến nhận toa</w:t>
+        <w:t xml:space="preserve">1. </w:t>
+      </w:r>
+      <w:r>
+        <w:rPr>
+          <w:noProof/>
+        </w:rPr>
+        <w:t>Use Case tổng quát</w:t>
       </w:r>
     </w:p>
     <w:p>
@@ -5937,16 +5943,19 @@
     <w:p>
       <w:pPr>
         <w:pStyle w:val="Strong1"/>
+        <w:rPr>
+          <w:lang w:val="en-US"/>
+        </w:rPr>
       </w:pPr>
       <w:r>
         <w:rPr>
-          <w:noProof/>
+          <w:lang w:val="en-US"/>
         </w:rPr>
         <w:drawing>
-          <wp:inline distT="0" distB="0" distL="0" distR="0" wp14:anchorId="200D6461" wp14:editId="1430FCB5">
-            <wp:extent cx="6141720" cy="3581400"/>
-            <wp:effectExtent l="0" t="0" r="0" b="0"/>
-            <wp:docPr id="150583000" name="Picture 2"/>
+          <wp:inline distT="0" distB="0" distL="0" distR="0" wp14:anchorId="7DA4CF78" wp14:editId="2B8E883D">
+            <wp:extent cx="6109970" cy="4259580"/>
+            <wp:effectExtent l="0" t="0" r="5080" b="7620"/>
+            <wp:docPr id="183489747" name="Picture 11"/>
             <wp:cNvGraphicFramePr>
               <a:graphicFrameLocks xmlns:a="http://schemas.openxmlformats.org/drawingml/2006/main" noChangeAspect="1"/>
             </wp:cNvGraphicFramePr>
@@ -5954,7 +5963,7 @@
               <a:graphicData uri="http://schemas.openxmlformats.org/drawingml/2006/picture">
                 <pic:pic xmlns:pic="http://schemas.openxmlformats.org/drawingml/2006/picture">
                   <pic:nvPicPr>
-                    <pic:cNvPr id="0" name="Picture 1"/>
+                    <pic:cNvPr id="0" name="Picture 34"/>
                     <pic:cNvPicPr>
                       <a:picLocks noChangeAspect="1" noChangeArrowheads="1"/>
                     </pic:cNvPicPr>
@@ -5975,7 +5984,7 @@
                   <pic:spPr bwMode="auto">
                     <a:xfrm>
                       <a:off x="0" y="0"/>
-                      <a:ext cx="6141720" cy="3581400"/>
+                      <a:ext cx="6116816" cy="4264353"/>
                     </a:xfrm>
                     <a:prstGeom prst="rect">
                       <a:avLst/>
@@ -5991,6 +6000,19 @@
           </wp:inline>
         </w:drawing>
       </w:r>
+    </w:p>
+    <w:p>
+      <w:pPr>
+        <w:pStyle w:val="Strong1"/>
+        <w:rPr>
+          <w:lang w:val="en-US"/>
+        </w:rPr>
+      </w:pPr>
+    </w:p>
+    <w:p>
+      <w:pPr>
+        <w:pStyle w:val="Strong1"/>
+      </w:pPr>
     </w:p>
     <w:p>
       <w:pPr>
@@ -6010,7 +6032,13 @@
       </w:pPr>
       <w:r>
         <w:lastRenderedPageBreak/>
-        <w:t>2. Activity diagram đăng ký khám đến nhận toa</w:t>
+        <w:t xml:space="preserve">2. </w:t>
+      </w:r>
+      <w:r>
+        <w:rPr>
+          <w:noProof/>
+        </w:rPr>
+        <w:t>Use case chi tiết từ đăng ký khám đến nhận toa</w:t>
       </w:r>
     </w:p>
     <w:p>
@@ -6018,16 +6046,19 @@
         <w:spacing w:after="120" w:line="300" w:lineRule="auto"/>
         <w:ind w:firstLine="425"/>
         <w:jc w:val="both"/>
+        <w:rPr>
+          <w:lang w:val="en-US"/>
+        </w:rPr>
       </w:pPr>
       <w:r>
         <w:rPr>
-          <w:noProof/>
+          <w:lang w:val="en-US"/>
         </w:rPr>
         <w:drawing>
-          <wp:inline distT="0" distB="0" distL="0" distR="0" wp14:anchorId="096ED95D" wp14:editId="3BF3F251">
-            <wp:extent cx="6141720" cy="3840480"/>
+          <wp:inline distT="0" distB="0" distL="0" distR="0" wp14:anchorId="39E29EFB" wp14:editId="04577E22">
+            <wp:extent cx="5836452" cy="4450080"/>
             <wp:effectExtent l="0" t="0" r="0" b="7620"/>
-            <wp:docPr id="1755636261" name="Picture 3"/>
+            <wp:docPr id="472301742" name="Picture 9"/>
             <wp:cNvGraphicFramePr>
               <a:graphicFrameLocks xmlns:a="http://schemas.openxmlformats.org/drawingml/2006/main" noChangeAspect="1"/>
             </wp:cNvGraphicFramePr>
@@ -6035,7 +6066,7 @@
               <a:graphicData uri="http://schemas.openxmlformats.org/drawingml/2006/picture">
                 <pic:pic xmlns:pic="http://schemas.openxmlformats.org/drawingml/2006/picture">
                   <pic:nvPicPr>
-                    <pic:cNvPr id="0" name="Picture 2"/>
+                    <pic:cNvPr id="0" name="Picture 27"/>
                     <pic:cNvPicPr>
                       <a:picLocks noChangeAspect="1" noChangeArrowheads="1"/>
                     </pic:cNvPicPr>
@@ -6056,7 +6087,7 @@
                   <pic:spPr bwMode="auto">
                     <a:xfrm>
                       <a:off x="0" y="0"/>
-                      <a:ext cx="6141720" cy="3840480"/>
+                      <a:ext cx="5854733" cy="4464018"/>
                     </a:xfrm>
                     <a:prstGeom prst="rect">
                       <a:avLst/>
@@ -6072,6 +6103,13 @@
           </wp:inline>
         </w:drawing>
       </w:r>
+    </w:p>
+    <w:p>
+      <w:pPr>
+        <w:spacing w:after="120" w:line="300" w:lineRule="auto"/>
+        <w:ind w:firstLine="425"/>
+        <w:jc w:val="both"/>
+      </w:pPr>
     </w:p>
     <w:p>
       <w:pPr>
@@ -6098,19 +6136,31 @@
           <w:noProof/>
         </w:rPr>
         <w:lastRenderedPageBreak/>
-        <w:t>3. Sequence diagram- lập toa thuốc</w:t>
+        <w:t xml:space="preserve">3. </w:t>
+      </w:r>
+      <w:r>
+        <w:rPr>
+          <w:b/>
+          <w:bCs/>
+        </w:rPr>
+        <w:t>Activity diagram đăng ký khám đến nhận toa</w:t>
       </w:r>
     </w:p>
     <w:p>
+      <w:pPr>
+        <w:rPr>
+          <w:lang w:val="en-US"/>
+        </w:rPr>
+      </w:pPr>
       <w:r>
         <w:rPr>
-          <w:noProof/>
+          <w:lang w:val="en-US"/>
         </w:rPr>
         <w:drawing>
-          <wp:inline distT="0" distB="0" distL="0" distR="0" wp14:anchorId="04681931" wp14:editId="0BE71A98">
-            <wp:extent cx="6152515" cy="3845560"/>
-            <wp:effectExtent l="0" t="0" r="635" b="2540"/>
-            <wp:docPr id="275616618" name="Picture 6"/>
+          <wp:inline distT="0" distB="0" distL="0" distR="0" wp14:anchorId="7BB02CED" wp14:editId="7B303B15">
+            <wp:extent cx="6096000" cy="4739640"/>
+            <wp:effectExtent l="0" t="0" r="0" b="3810"/>
+            <wp:docPr id="57091813" name="Picture 7"/>
             <wp:cNvGraphicFramePr>
               <a:graphicFrameLocks xmlns:a="http://schemas.openxmlformats.org/drawingml/2006/main" noChangeAspect="1"/>
             </wp:cNvGraphicFramePr>
@@ -6118,8 +6168,10 @@
               <a:graphicData uri="http://schemas.openxmlformats.org/drawingml/2006/picture">
                 <pic:pic xmlns:pic="http://schemas.openxmlformats.org/drawingml/2006/picture">
                   <pic:nvPicPr>
-                    <pic:cNvPr id="275616618" name="Picture 275616618"/>
-                    <pic:cNvPicPr/>
+                    <pic:cNvPr id="0" name="Picture 20"/>
+                    <pic:cNvPicPr>
+                      <a:picLocks noChangeAspect="1" noChangeArrowheads="1"/>
+                    </pic:cNvPicPr>
                   </pic:nvPicPr>
                   <pic:blipFill>
                     <a:blip r:embed="rId9" cstate="print">
@@ -6129,18 +6181,23 @@
                         </a:ext>
                       </a:extLst>
                     </a:blip>
+                    <a:srcRect/>
                     <a:stretch>
                       <a:fillRect/>
                     </a:stretch>
                   </pic:blipFill>
-                  <pic:spPr>
+                  <pic:spPr bwMode="auto">
                     <a:xfrm>
                       <a:off x="0" y="0"/>
-                      <a:ext cx="6152515" cy="3845560"/>
+                      <a:ext cx="6096000" cy="4739640"/>
                     </a:xfrm>
                     <a:prstGeom prst="rect">
                       <a:avLst/>
                     </a:prstGeom>
+                    <a:noFill/>
+                    <a:ln>
+                      <a:noFill/>
+                    </a:ln>
                   </pic:spPr>
                 </pic:pic>
               </a:graphicData>
@@ -6149,6 +6206,7 @@
         </w:drawing>
       </w:r>
     </w:p>
+    <w:p/>
     <w:p>
       <w:pPr>
         <w:spacing w:after="120" w:line="300" w:lineRule="auto"/>
@@ -6164,7 +6222,15 @@
           <w:b/>
           <w:bCs/>
         </w:rPr>
-        <w:t>4. Class diagram quản lý hồ sơ bệnh án</w:t>
+        <w:t xml:space="preserve">4. </w:t>
+      </w:r>
+      <w:r>
+        <w:rPr>
+          <w:b/>
+          <w:bCs/>
+          <w:noProof/>
+        </w:rPr>
+        <w:t>Sequence diagram- lập toa thuốc</w:t>
       </w:r>
     </w:p>
     <w:p>
@@ -6172,16 +6238,20 @@
         <w:spacing w:after="120" w:line="300" w:lineRule="auto"/>
         <w:ind w:firstLine="425"/>
         <w:jc w:val="both"/>
+        <w:rPr>
+          <w:lang w:val="en-US"/>
+        </w:rPr>
       </w:pPr>
       <w:r>
         <w:rPr>
-          <w:noProof/>
+          <w:lang w:val="en-US"/>
         </w:rPr>
+        <w:lastRenderedPageBreak/>
         <w:drawing>
-          <wp:inline distT="0" distB="0" distL="0" distR="0" wp14:anchorId="55C9E680" wp14:editId="59AAE384">
-            <wp:extent cx="6152515" cy="3845560"/>
-            <wp:effectExtent l="0" t="0" r="635" b="2540"/>
-            <wp:docPr id="740606441" name="Picture 7"/>
+          <wp:inline distT="0" distB="0" distL="0" distR="0" wp14:anchorId="4E07AD18" wp14:editId="4C65DF31">
+            <wp:extent cx="5878195" cy="4556760"/>
+            <wp:effectExtent l="0" t="0" r="0" b="0"/>
+            <wp:docPr id="1925967020" name="Picture 5"/>
             <wp:cNvGraphicFramePr>
               <a:graphicFrameLocks xmlns:a="http://schemas.openxmlformats.org/drawingml/2006/main" noChangeAspect="1"/>
             </wp:cNvGraphicFramePr>
@@ -6189,8 +6259,10 @@
               <a:graphicData uri="http://schemas.openxmlformats.org/drawingml/2006/picture">
                 <pic:pic xmlns:pic="http://schemas.openxmlformats.org/drawingml/2006/picture">
                   <pic:nvPicPr>
-                    <pic:cNvPr id="740606441" name="Picture 740606441"/>
-                    <pic:cNvPicPr/>
+                    <pic:cNvPr id="0" name="Picture 13"/>
+                    <pic:cNvPicPr>
+                      <a:picLocks noChangeAspect="1" noChangeArrowheads="1"/>
+                    </pic:cNvPicPr>
                   </pic:nvPicPr>
                   <pic:blipFill>
                     <a:blip r:embed="rId10" cstate="print">
@@ -6200,18 +6272,23 @@
                         </a:ext>
                       </a:extLst>
                     </a:blip>
+                    <a:srcRect/>
                     <a:stretch>
                       <a:fillRect/>
                     </a:stretch>
                   </pic:blipFill>
-                  <pic:spPr>
+                  <pic:spPr bwMode="auto">
                     <a:xfrm>
                       <a:off x="0" y="0"/>
-                      <a:ext cx="6152515" cy="3845560"/>
+                      <a:ext cx="5878195" cy="4556760"/>
                     </a:xfrm>
                     <a:prstGeom prst="rect">
                       <a:avLst/>
                     </a:prstGeom>
+                    <a:noFill/>
+                    <a:ln>
+                      <a:noFill/>
+                    </a:ln>
                   </pic:spPr>
                 </pic:pic>
               </a:graphicData>
@@ -6235,17 +6312,27 @@
         <w:rPr>
           <w:b/>
           <w:bCs/>
-          <w:noProof/>
+          <w:sz w:val="28"/>
+          <w:szCs w:val="28"/>
         </w:rPr>
       </w:pPr>
       <w:r>
         <w:rPr>
           <w:b/>
           <w:bCs/>
-          <w:noProof/>
+          <w:sz w:val="28"/>
+          <w:szCs w:val="28"/>
         </w:rPr>
-        <w:lastRenderedPageBreak/>
-        <w:t>5. Use case tổng quát</w:t>
+        <w:t xml:space="preserve">5. </w:t>
+      </w:r>
+      <w:r>
+        <w:rPr>
+          <w:b/>
+          <w:bCs/>
+          <w:sz w:val="28"/>
+          <w:szCs w:val="28"/>
+        </w:rPr>
+        <w:t>Class diagram quản lý hồ sơ bệnh án</w:t>
       </w:r>
     </w:p>
     <w:p>
@@ -6253,16 +6340,3368 @@
         <w:spacing w:after="120" w:line="300" w:lineRule="auto"/>
         <w:ind w:firstLine="425"/>
         <w:jc w:val="both"/>
+        <w:rPr>
+          <w:b/>
+          <w:bCs/>
+          <w:lang w:val="en-US"/>
+        </w:rPr>
+      </w:pPr>
+      <w:proofErr w:type="spellStart"/>
+      <w:r>
+        <w:rPr>
+          <w:b/>
+          <w:bCs/>
+          <w:lang w:val="en-US"/>
+        </w:rPr>
+        <w:t>Bảng</w:t>
+      </w:r>
+      <w:proofErr w:type="spellEnd"/>
+      <w:r>
+        <w:rPr>
+          <w:b/>
+          <w:bCs/>
+          <w:lang w:val="en-US"/>
+        </w:rPr>
+        <w:t xml:space="preserve"> </w:t>
+      </w:r>
+      <w:proofErr w:type="spellStart"/>
+      <w:r>
+        <w:rPr>
+          <w:b/>
+          <w:bCs/>
+          <w:lang w:val="en-US"/>
+        </w:rPr>
+        <w:t>mô</w:t>
+      </w:r>
+      <w:proofErr w:type="spellEnd"/>
+      <w:r>
+        <w:rPr>
+          <w:b/>
+          <w:bCs/>
+          <w:lang w:val="en-US"/>
+        </w:rPr>
+        <w:t xml:space="preserve"> </w:t>
+      </w:r>
+      <w:proofErr w:type="spellStart"/>
+      <w:r>
+        <w:rPr>
+          <w:b/>
+          <w:bCs/>
+          <w:lang w:val="en-US"/>
+        </w:rPr>
+        <w:t>tả</w:t>
+      </w:r>
+      <w:proofErr w:type="spellEnd"/>
+      <w:r>
+        <w:rPr>
+          <w:b/>
+          <w:bCs/>
+          <w:lang w:val="en-US"/>
+        </w:rPr>
+        <w:t xml:space="preserve"> </w:t>
+      </w:r>
+      <w:proofErr w:type="spellStart"/>
+      <w:r>
+        <w:rPr>
+          <w:b/>
+          <w:bCs/>
+          <w:lang w:val="en-US"/>
+        </w:rPr>
+        <w:t>lớp</w:t>
+      </w:r>
+      <w:proofErr w:type="spellEnd"/>
+    </w:p>
+    <w:tbl>
+      <w:tblPr>
+        <w:tblStyle w:val="GridTable5Dark-Accent1"/>
+        <w:tblW w:w="0" w:type="auto"/>
+        <w:tblLayout w:type="fixed"/>
+        <w:tblLook w:val="04A0" w:firstRow="1" w:lastRow="0" w:firstColumn="1" w:lastColumn="0" w:noHBand="0" w:noVBand="1"/>
+      </w:tblPr>
+      <w:tblGrid>
+        <w:gridCol w:w="1823"/>
+        <w:gridCol w:w="1387"/>
+        <w:gridCol w:w="3579"/>
+        <w:gridCol w:w="2890"/>
+      </w:tblGrid>
+      <w:tr>
+        <w:trPr>
+          <w:cnfStyle w:val="100000000000" w:firstRow="1" w:lastRow="0" w:firstColumn="0" w:lastColumn="0" w:oddVBand="0" w:evenVBand="0" w:oddHBand="0" w:evenHBand="0" w:firstRowFirstColumn="0" w:firstRowLastColumn="0" w:lastRowFirstColumn="0" w:lastRowLastColumn="0"/>
+        </w:trPr>
+        <w:tc>
+          <w:tcPr>
+            <w:cnfStyle w:val="001000000000" w:firstRow="0" w:lastRow="0" w:firstColumn="1" w:lastColumn="0" w:oddVBand="0" w:evenVBand="0" w:oddHBand="0" w:evenHBand="0" w:firstRowFirstColumn="0" w:firstRowLastColumn="0" w:lastRowFirstColumn="0" w:lastRowLastColumn="0"/>
+            <w:tcW w:w="1823" w:type="dxa"/>
+            <w:hideMark/>
+          </w:tcPr>
+          <w:p>
+            <w:pPr>
+              <w:spacing w:after="120" w:line="300" w:lineRule="auto"/>
+              <w:ind w:firstLine="425"/>
+              <w:jc w:val="both"/>
+              <w:rPr>
+                <w:lang w:val="en-US"/>
+              </w:rPr>
+            </w:pPr>
+            <w:proofErr w:type="spellStart"/>
+            <w:r>
+              <w:rPr>
+                <w:lang w:val="en-US"/>
+              </w:rPr>
+              <w:t>Lớp</w:t>
+            </w:r>
+            <w:proofErr w:type="spellEnd"/>
+          </w:p>
+        </w:tc>
+        <w:tc>
+          <w:tcPr>
+            <w:tcW w:w="1387" w:type="dxa"/>
+            <w:hideMark/>
+          </w:tcPr>
+          <w:p>
+            <w:pPr>
+              <w:spacing w:after="120" w:line="300" w:lineRule="auto"/>
+              <w:ind w:firstLine="425"/>
+              <w:jc w:val="both"/>
+              <w:cnfStyle w:val="100000000000" w:firstRow="1" w:lastRow="0" w:firstColumn="0" w:lastColumn="0" w:oddVBand="0" w:evenVBand="0" w:oddHBand="0" w:evenHBand="0" w:firstRowFirstColumn="0" w:firstRowLastColumn="0" w:lastRowFirstColumn="0" w:lastRowLastColumn="0"/>
+              <w:rPr>
+                <w:lang w:val="en-US"/>
+              </w:rPr>
+            </w:pPr>
+            <w:r>
+              <w:rPr>
+                <w:lang w:val="en-US"/>
+              </w:rPr>
+              <w:t>ID</w:t>
+            </w:r>
+          </w:p>
+        </w:tc>
+        <w:tc>
+          <w:tcPr>
+            <w:tcW w:w="3579" w:type="dxa"/>
+            <w:hideMark/>
+          </w:tcPr>
+          <w:p>
+            <w:pPr>
+              <w:spacing w:after="120" w:line="300" w:lineRule="auto"/>
+              <w:ind w:firstLine="425"/>
+              <w:jc w:val="both"/>
+              <w:cnfStyle w:val="100000000000" w:firstRow="1" w:lastRow="0" w:firstColumn="0" w:lastColumn="0" w:oddVBand="0" w:evenVBand="0" w:oddHBand="0" w:evenHBand="0" w:firstRowFirstColumn="0" w:firstRowLastColumn="0" w:lastRowFirstColumn="0" w:lastRowLastColumn="0"/>
+              <w:rPr>
+                <w:lang w:val="en-US"/>
+              </w:rPr>
+            </w:pPr>
+            <w:proofErr w:type="spellStart"/>
+            <w:r>
+              <w:rPr>
+                <w:lang w:val="en-US"/>
+              </w:rPr>
+              <w:t>Thuộc</w:t>
+            </w:r>
+            <w:proofErr w:type="spellEnd"/>
+            <w:r>
+              <w:rPr>
+                <w:lang w:val="en-US"/>
+              </w:rPr>
+              <w:t xml:space="preserve"> </w:t>
+            </w:r>
+            <w:proofErr w:type="spellStart"/>
+            <w:r>
+              <w:rPr>
+                <w:lang w:val="en-US"/>
+              </w:rPr>
+              <w:t>tính</w:t>
+            </w:r>
+            <w:proofErr w:type="spellEnd"/>
+          </w:p>
+        </w:tc>
+        <w:tc>
+          <w:tcPr>
+            <w:tcW w:w="2890" w:type="dxa"/>
+            <w:hideMark/>
+          </w:tcPr>
+          <w:p>
+            <w:pPr>
+              <w:spacing w:after="120" w:line="300" w:lineRule="auto"/>
+              <w:ind w:firstLine="425"/>
+              <w:jc w:val="both"/>
+              <w:cnfStyle w:val="100000000000" w:firstRow="1" w:lastRow="0" w:firstColumn="0" w:lastColumn="0" w:oddVBand="0" w:evenVBand="0" w:oddHBand="0" w:evenHBand="0" w:firstRowFirstColumn="0" w:firstRowLastColumn="0" w:lastRowFirstColumn="0" w:lastRowLastColumn="0"/>
+              <w:rPr>
+                <w:lang w:val="en-US"/>
+              </w:rPr>
+            </w:pPr>
+            <w:r>
+              <w:rPr>
+                <w:lang w:val="en-US"/>
+              </w:rPr>
+              <w:t xml:space="preserve">Phương </w:t>
+            </w:r>
+            <w:proofErr w:type="spellStart"/>
+            <w:r>
+              <w:rPr>
+                <w:lang w:val="en-US"/>
+              </w:rPr>
+              <w:t>thức</w:t>
+            </w:r>
+            <w:proofErr w:type="spellEnd"/>
+          </w:p>
+        </w:tc>
+      </w:tr>
+      <w:tr>
+        <w:trPr>
+          <w:cnfStyle w:val="000000100000" w:firstRow="0" w:lastRow="0" w:firstColumn="0" w:lastColumn="0" w:oddVBand="0" w:evenVBand="0" w:oddHBand="1" w:evenHBand="0" w:firstRowFirstColumn="0" w:firstRowLastColumn="0" w:lastRowFirstColumn="0" w:lastRowLastColumn="0"/>
+        </w:trPr>
+        <w:tc>
+          <w:tcPr>
+            <w:cnfStyle w:val="001000000000" w:firstRow="0" w:lastRow="0" w:firstColumn="1" w:lastColumn="0" w:oddVBand="0" w:evenVBand="0" w:oddHBand="0" w:evenHBand="0" w:firstRowFirstColumn="0" w:firstRowLastColumn="0" w:lastRowFirstColumn="0" w:lastRowLastColumn="0"/>
+            <w:tcW w:w="1823" w:type="dxa"/>
+            <w:hideMark/>
+          </w:tcPr>
+          <w:p>
+            <w:pPr>
+              <w:spacing w:after="120" w:line="300" w:lineRule="auto"/>
+              <w:ind w:firstLine="425"/>
+              <w:jc w:val="both"/>
+              <w:rPr>
+                <w:lang w:val="en-US"/>
+              </w:rPr>
+            </w:pPr>
+            <w:proofErr w:type="spellStart"/>
+            <w:r>
+              <w:rPr>
+                <w:lang w:val="en-US"/>
+              </w:rPr>
+              <w:t>Bệnh</w:t>
+            </w:r>
+            <w:proofErr w:type="spellEnd"/>
+            <w:r>
+              <w:rPr>
+                <w:lang w:val="en-US"/>
+              </w:rPr>
+              <w:t xml:space="preserve"> </w:t>
+            </w:r>
+            <w:proofErr w:type="spellStart"/>
+            <w:r>
+              <w:rPr>
+                <w:lang w:val="en-US"/>
+              </w:rPr>
+              <w:t>nhân</w:t>
+            </w:r>
+            <w:proofErr w:type="spellEnd"/>
+          </w:p>
+        </w:tc>
+        <w:tc>
+          <w:tcPr>
+            <w:tcW w:w="1387" w:type="dxa"/>
+            <w:hideMark/>
+          </w:tcPr>
+          <w:p>
+            <w:pPr>
+              <w:spacing w:after="120" w:line="300" w:lineRule="auto"/>
+              <w:ind w:firstLine="425"/>
+              <w:jc w:val="both"/>
+              <w:cnfStyle w:val="000000100000" w:firstRow="0" w:lastRow="0" w:firstColumn="0" w:lastColumn="0" w:oddVBand="0" w:evenVBand="0" w:oddHBand="1" w:evenHBand="0" w:firstRowFirstColumn="0" w:firstRowLastColumn="0" w:lastRowFirstColumn="0" w:lastRowLastColumn="0"/>
+              <w:rPr>
+                <w:lang w:val="en-US"/>
+              </w:rPr>
+            </w:pPr>
+            <w:proofErr w:type="spellStart"/>
+            <w:r>
+              <w:rPr>
+                <w:lang w:val="en-US"/>
+              </w:rPr>
+              <w:t>Mã</w:t>
+            </w:r>
+            <w:proofErr w:type="spellEnd"/>
+            <w:r>
+              <w:rPr>
+                <w:lang w:val="en-US"/>
+              </w:rPr>
+              <w:t xml:space="preserve"> </w:t>
+            </w:r>
+            <w:proofErr w:type="spellStart"/>
+            <w:r>
+              <w:rPr>
+                <w:lang w:val="en-US"/>
+              </w:rPr>
+              <w:t>bệnh</w:t>
+            </w:r>
+            <w:proofErr w:type="spellEnd"/>
+            <w:r>
+              <w:rPr>
+                <w:lang w:val="en-US"/>
+              </w:rPr>
+              <w:t xml:space="preserve"> </w:t>
+            </w:r>
+            <w:proofErr w:type="spellStart"/>
+            <w:r>
+              <w:rPr>
+                <w:lang w:val="en-US"/>
+              </w:rPr>
+              <w:t>nhân</w:t>
+            </w:r>
+            <w:proofErr w:type="spellEnd"/>
+          </w:p>
+        </w:tc>
+        <w:tc>
+          <w:tcPr>
+            <w:tcW w:w="3579" w:type="dxa"/>
+            <w:hideMark/>
+          </w:tcPr>
+          <w:p>
+            <w:pPr>
+              <w:spacing w:after="120" w:line="300" w:lineRule="auto"/>
+              <w:ind w:firstLine="425"/>
+              <w:jc w:val="both"/>
+              <w:cnfStyle w:val="000000100000" w:firstRow="0" w:lastRow="0" w:firstColumn="0" w:lastColumn="0" w:oddVBand="0" w:evenVBand="0" w:oddHBand="1" w:evenHBand="0" w:firstRowFirstColumn="0" w:firstRowLastColumn="0" w:lastRowFirstColumn="0" w:lastRowLastColumn="0"/>
+              <w:rPr>
+                <w:lang w:val="en-US"/>
+              </w:rPr>
+            </w:pPr>
+            <w:proofErr w:type="spellStart"/>
+            <w:r>
+              <w:rPr>
+                <w:lang w:val="en-US"/>
+              </w:rPr>
+              <w:t>Họ</w:t>
+            </w:r>
+            <w:proofErr w:type="spellEnd"/>
+            <w:r>
+              <w:rPr>
+                <w:lang w:val="en-US"/>
+              </w:rPr>
+              <w:t xml:space="preserve"> </w:t>
+            </w:r>
+            <w:proofErr w:type="spellStart"/>
+            <w:r>
+              <w:rPr>
+                <w:lang w:val="en-US"/>
+              </w:rPr>
+              <w:t>tên</w:t>
+            </w:r>
+            <w:proofErr w:type="spellEnd"/>
+            <w:r>
+              <w:rPr>
+                <w:lang w:val="en-US"/>
+              </w:rPr>
+              <w:t xml:space="preserve">, </w:t>
+            </w:r>
+            <w:proofErr w:type="spellStart"/>
+            <w:r>
+              <w:rPr>
+                <w:lang w:val="en-US"/>
+              </w:rPr>
+              <w:t>ngày</w:t>
+            </w:r>
+            <w:proofErr w:type="spellEnd"/>
+            <w:r>
+              <w:rPr>
+                <w:lang w:val="en-US"/>
+              </w:rPr>
+              <w:t xml:space="preserve"> </w:t>
+            </w:r>
+            <w:proofErr w:type="spellStart"/>
+            <w:r>
+              <w:rPr>
+                <w:lang w:val="en-US"/>
+              </w:rPr>
+              <w:t>sinh</w:t>
+            </w:r>
+            <w:proofErr w:type="spellEnd"/>
+            <w:r>
+              <w:rPr>
+                <w:lang w:val="en-US"/>
+              </w:rPr>
+              <w:t xml:space="preserve">, </w:t>
+            </w:r>
+            <w:proofErr w:type="spellStart"/>
+            <w:r>
+              <w:rPr>
+                <w:lang w:val="en-US"/>
+              </w:rPr>
+              <w:t>địa</w:t>
+            </w:r>
+            <w:proofErr w:type="spellEnd"/>
+            <w:r>
+              <w:rPr>
+                <w:lang w:val="en-US"/>
+              </w:rPr>
+              <w:t xml:space="preserve"> </w:t>
+            </w:r>
+            <w:proofErr w:type="spellStart"/>
+            <w:r>
+              <w:rPr>
+                <w:lang w:val="en-US"/>
+              </w:rPr>
+              <w:t>chỉ</w:t>
+            </w:r>
+            <w:proofErr w:type="spellEnd"/>
+            <w:r>
+              <w:rPr>
+                <w:lang w:val="en-US"/>
+              </w:rPr>
+              <w:t xml:space="preserve">, </w:t>
+            </w:r>
+            <w:proofErr w:type="spellStart"/>
+            <w:r>
+              <w:rPr>
+                <w:lang w:val="en-US"/>
+              </w:rPr>
+              <w:t>điện</w:t>
+            </w:r>
+            <w:proofErr w:type="spellEnd"/>
+            <w:r>
+              <w:rPr>
+                <w:lang w:val="en-US"/>
+              </w:rPr>
+              <w:t xml:space="preserve"> </w:t>
+            </w:r>
+            <w:proofErr w:type="spellStart"/>
+            <w:r>
+              <w:rPr>
+                <w:lang w:val="en-US"/>
+              </w:rPr>
+              <w:t>thoại</w:t>
+            </w:r>
+            <w:proofErr w:type="spellEnd"/>
+            <w:r>
+              <w:rPr>
+                <w:lang w:val="en-US"/>
+              </w:rPr>
+              <w:t xml:space="preserve">, </w:t>
+            </w:r>
+            <w:proofErr w:type="spellStart"/>
+            <w:r>
+              <w:rPr>
+                <w:lang w:val="en-US"/>
+              </w:rPr>
+              <w:t>ảnh</w:t>
+            </w:r>
+            <w:proofErr w:type="spellEnd"/>
+            <w:r>
+              <w:rPr>
+                <w:lang w:val="en-US"/>
+              </w:rPr>
+              <w:t xml:space="preserve"> 3x4</w:t>
+            </w:r>
+          </w:p>
+        </w:tc>
+        <w:tc>
+          <w:tcPr>
+            <w:tcW w:w="2890" w:type="dxa"/>
+            <w:hideMark/>
+          </w:tcPr>
+          <w:p>
+            <w:pPr>
+              <w:spacing w:after="120" w:line="300" w:lineRule="auto"/>
+              <w:ind w:firstLine="425"/>
+              <w:jc w:val="both"/>
+              <w:cnfStyle w:val="000000100000" w:firstRow="0" w:lastRow="0" w:firstColumn="0" w:lastColumn="0" w:oddVBand="0" w:evenVBand="0" w:oddHBand="1" w:evenHBand="0" w:firstRowFirstColumn="0" w:firstRowLastColumn="0" w:lastRowFirstColumn="0" w:lastRowLastColumn="0"/>
+              <w:rPr>
+                <w:lang w:val="en-US"/>
+              </w:rPr>
+            </w:pPr>
+            <w:proofErr w:type="spellStart"/>
+            <w:r>
+              <w:rPr>
+                <w:lang w:val="en-US"/>
+              </w:rPr>
+              <w:t>Đăng</w:t>
+            </w:r>
+            <w:proofErr w:type="spellEnd"/>
+            <w:r>
+              <w:rPr>
+                <w:lang w:val="en-US"/>
+              </w:rPr>
+              <w:t xml:space="preserve"> </w:t>
+            </w:r>
+            <w:proofErr w:type="spellStart"/>
+            <w:proofErr w:type="gramStart"/>
+            <w:r>
+              <w:rPr>
+                <w:lang w:val="en-US"/>
+              </w:rPr>
+              <w:t>ký</w:t>
+            </w:r>
+            <w:proofErr w:type="spellEnd"/>
+            <w:r>
+              <w:rPr>
+                <w:lang w:val="en-US"/>
+              </w:rPr>
+              <w:t>(</w:t>
+            </w:r>
+            <w:proofErr w:type="gramEnd"/>
+            <w:r>
+              <w:rPr>
+                <w:lang w:val="en-US"/>
+              </w:rPr>
+              <w:t xml:space="preserve">), </w:t>
+            </w:r>
+            <w:proofErr w:type="spellStart"/>
+            <w:r>
+              <w:rPr>
+                <w:lang w:val="en-US"/>
+              </w:rPr>
+              <w:t>Cập</w:t>
+            </w:r>
+            <w:proofErr w:type="spellEnd"/>
+            <w:r>
+              <w:rPr>
+                <w:lang w:val="en-US"/>
+              </w:rPr>
+              <w:t xml:space="preserve"> </w:t>
+            </w:r>
+            <w:proofErr w:type="spellStart"/>
+            <w:r>
+              <w:rPr>
+                <w:lang w:val="en-US"/>
+              </w:rPr>
+              <w:t>nhật</w:t>
+            </w:r>
+            <w:proofErr w:type="spellEnd"/>
+            <w:r>
+              <w:rPr>
+                <w:lang w:val="en-US"/>
+              </w:rPr>
+              <w:t xml:space="preserve"> </w:t>
+            </w:r>
+            <w:proofErr w:type="spellStart"/>
+            <w:r>
+              <w:rPr>
+                <w:lang w:val="en-US"/>
+              </w:rPr>
+              <w:t>thông</w:t>
+            </w:r>
+            <w:proofErr w:type="spellEnd"/>
+            <w:r>
+              <w:rPr>
+                <w:lang w:val="en-US"/>
+              </w:rPr>
+              <w:t xml:space="preserve"> </w:t>
+            </w:r>
+            <w:proofErr w:type="gramStart"/>
+            <w:r>
+              <w:rPr>
+                <w:lang w:val="en-US"/>
+              </w:rPr>
+              <w:t>tin(</w:t>
+            </w:r>
+            <w:proofErr w:type="gramEnd"/>
+            <w:r>
+              <w:rPr>
+                <w:lang w:val="en-US"/>
+              </w:rPr>
+              <w:t>)</w:t>
+            </w:r>
+          </w:p>
+        </w:tc>
+      </w:tr>
+      <w:tr>
+        <w:tc>
+          <w:tcPr>
+            <w:cnfStyle w:val="001000000000" w:firstRow="0" w:lastRow="0" w:firstColumn="1" w:lastColumn="0" w:oddVBand="0" w:evenVBand="0" w:oddHBand="0" w:evenHBand="0" w:firstRowFirstColumn="0" w:firstRowLastColumn="0" w:lastRowFirstColumn="0" w:lastRowLastColumn="0"/>
+            <w:tcW w:w="1823" w:type="dxa"/>
+            <w:hideMark/>
+          </w:tcPr>
+          <w:p>
+            <w:pPr>
+              <w:spacing w:after="120" w:line="300" w:lineRule="auto"/>
+              <w:ind w:firstLine="425"/>
+              <w:jc w:val="both"/>
+              <w:rPr>
+                <w:lang w:val="en-US"/>
+              </w:rPr>
+            </w:pPr>
+            <w:proofErr w:type="spellStart"/>
+            <w:r>
+              <w:rPr>
+                <w:lang w:val="en-US"/>
+              </w:rPr>
+              <w:t>Hồ</w:t>
+            </w:r>
+            <w:proofErr w:type="spellEnd"/>
+            <w:r>
+              <w:rPr>
+                <w:lang w:val="en-US"/>
+              </w:rPr>
+              <w:t xml:space="preserve"> </w:t>
+            </w:r>
+            <w:proofErr w:type="spellStart"/>
+            <w:r>
+              <w:rPr>
+                <w:lang w:val="en-US"/>
+              </w:rPr>
+              <w:t>sơ</w:t>
+            </w:r>
+            <w:proofErr w:type="spellEnd"/>
+            <w:r>
+              <w:rPr>
+                <w:lang w:val="en-US"/>
+              </w:rPr>
+              <w:t xml:space="preserve"> </w:t>
+            </w:r>
+            <w:proofErr w:type="spellStart"/>
+            <w:r>
+              <w:rPr>
+                <w:lang w:val="en-US"/>
+              </w:rPr>
+              <w:t>bệnh</w:t>
+            </w:r>
+            <w:proofErr w:type="spellEnd"/>
+            <w:r>
+              <w:rPr>
+                <w:lang w:val="en-US"/>
+              </w:rPr>
+              <w:t xml:space="preserve"> </w:t>
+            </w:r>
+            <w:proofErr w:type="spellStart"/>
+            <w:r>
+              <w:rPr>
+                <w:lang w:val="en-US"/>
+              </w:rPr>
+              <w:t>án</w:t>
+            </w:r>
+            <w:proofErr w:type="spellEnd"/>
+          </w:p>
+        </w:tc>
+        <w:tc>
+          <w:tcPr>
+            <w:tcW w:w="1387" w:type="dxa"/>
+            <w:hideMark/>
+          </w:tcPr>
+          <w:p>
+            <w:pPr>
+              <w:spacing w:after="120" w:line="300" w:lineRule="auto"/>
+              <w:ind w:firstLine="425"/>
+              <w:jc w:val="both"/>
+              <w:cnfStyle w:val="000000000000" w:firstRow="0" w:lastRow="0" w:firstColumn="0" w:lastColumn="0" w:oddVBand="0" w:evenVBand="0" w:oddHBand="0" w:evenHBand="0" w:firstRowFirstColumn="0" w:firstRowLastColumn="0" w:lastRowFirstColumn="0" w:lastRowLastColumn="0"/>
+              <w:rPr>
+                <w:lang w:val="en-US"/>
+              </w:rPr>
+            </w:pPr>
+            <w:proofErr w:type="spellStart"/>
+            <w:r>
+              <w:rPr>
+                <w:lang w:val="en-US"/>
+              </w:rPr>
+              <w:t>Mã</w:t>
+            </w:r>
+            <w:proofErr w:type="spellEnd"/>
+            <w:r>
+              <w:rPr>
+                <w:lang w:val="en-US"/>
+              </w:rPr>
+              <w:t xml:space="preserve"> </w:t>
+            </w:r>
+            <w:proofErr w:type="spellStart"/>
+            <w:r>
+              <w:rPr>
+                <w:lang w:val="en-US"/>
+              </w:rPr>
+              <w:t>hồ</w:t>
+            </w:r>
+            <w:proofErr w:type="spellEnd"/>
+            <w:r>
+              <w:rPr>
+                <w:lang w:val="en-US"/>
+              </w:rPr>
+              <w:t xml:space="preserve"> </w:t>
+            </w:r>
+            <w:proofErr w:type="spellStart"/>
+            <w:r>
+              <w:rPr>
+                <w:lang w:val="en-US"/>
+              </w:rPr>
+              <w:t>sơ</w:t>
+            </w:r>
+            <w:proofErr w:type="spellEnd"/>
+          </w:p>
+        </w:tc>
+        <w:tc>
+          <w:tcPr>
+            <w:tcW w:w="3579" w:type="dxa"/>
+            <w:hideMark/>
+          </w:tcPr>
+          <w:p>
+            <w:pPr>
+              <w:spacing w:after="120" w:line="300" w:lineRule="auto"/>
+              <w:ind w:firstLine="425"/>
+              <w:jc w:val="both"/>
+              <w:cnfStyle w:val="000000000000" w:firstRow="0" w:lastRow="0" w:firstColumn="0" w:lastColumn="0" w:oddVBand="0" w:evenVBand="0" w:oddHBand="0" w:evenHBand="0" w:firstRowFirstColumn="0" w:firstRowLastColumn="0" w:lastRowFirstColumn="0" w:lastRowLastColumn="0"/>
+              <w:rPr>
+                <w:lang w:val="en-US"/>
+              </w:rPr>
+            </w:pPr>
+            <w:proofErr w:type="spellStart"/>
+            <w:r>
+              <w:rPr>
+                <w:lang w:val="en-US"/>
+              </w:rPr>
+              <w:t>Mã</w:t>
+            </w:r>
+            <w:proofErr w:type="spellEnd"/>
+            <w:r>
+              <w:rPr>
+                <w:lang w:val="en-US"/>
+              </w:rPr>
+              <w:t xml:space="preserve"> </w:t>
+            </w:r>
+            <w:proofErr w:type="spellStart"/>
+            <w:r>
+              <w:rPr>
+                <w:lang w:val="en-US"/>
+              </w:rPr>
+              <w:t>bệnh</w:t>
+            </w:r>
+            <w:proofErr w:type="spellEnd"/>
+            <w:r>
+              <w:rPr>
+                <w:lang w:val="en-US"/>
+              </w:rPr>
+              <w:t xml:space="preserve"> </w:t>
+            </w:r>
+            <w:proofErr w:type="spellStart"/>
+            <w:r>
+              <w:rPr>
+                <w:lang w:val="en-US"/>
+              </w:rPr>
+              <w:t>nhân</w:t>
+            </w:r>
+            <w:proofErr w:type="spellEnd"/>
+            <w:r>
+              <w:rPr>
+                <w:lang w:val="en-US"/>
+              </w:rPr>
+              <w:t xml:space="preserve">, </w:t>
+            </w:r>
+            <w:proofErr w:type="spellStart"/>
+            <w:r>
+              <w:rPr>
+                <w:lang w:val="en-US"/>
+              </w:rPr>
+              <w:t>ngày</w:t>
+            </w:r>
+            <w:proofErr w:type="spellEnd"/>
+            <w:r>
+              <w:rPr>
+                <w:lang w:val="en-US"/>
+              </w:rPr>
+              <w:t xml:space="preserve"> </w:t>
+            </w:r>
+            <w:proofErr w:type="spellStart"/>
+            <w:r>
+              <w:rPr>
+                <w:lang w:val="en-US"/>
+              </w:rPr>
+              <w:t>cấp</w:t>
+            </w:r>
+            <w:proofErr w:type="spellEnd"/>
+            <w:r>
+              <w:rPr>
+                <w:lang w:val="en-US"/>
+              </w:rPr>
+              <w:t xml:space="preserve">, </w:t>
+            </w:r>
+            <w:proofErr w:type="spellStart"/>
+            <w:r>
+              <w:rPr>
+                <w:lang w:val="en-US"/>
+              </w:rPr>
+              <w:t>năm</w:t>
+            </w:r>
+            <w:proofErr w:type="spellEnd"/>
+            <w:r>
+              <w:rPr>
+                <w:lang w:val="en-US"/>
+              </w:rPr>
+              <w:t xml:space="preserve"> </w:t>
+            </w:r>
+            <w:proofErr w:type="spellStart"/>
+            <w:r>
+              <w:rPr>
+                <w:lang w:val="en-US"/>
+              </w:rPr>
+              <w:t>hiệu</w:t>
+            </w:r>
+            <w:proofErr w:type="spellEnd"/>
+            <w:r>
+              <w:rPr>
+                <w:lang w:val="en-US"/>
+              </w:rPr>
+              <w:t xml:space="preserve"> </w:t>
+            </w:r>
+            <w:proofErr w:type="spellStart"/>
+            <w:r>
+              <w:rPr>
+                <w:lang w:val="en-US"/>
+              </w:rPr>
+              <w:t>lực</w:t>
+            </w:r>
+            <w:proofErr w:type="spellEnd"/>
+            <w:r>
+              <w:rPr>
+                <w:lang w:val="en-US"/>
+              </w:rPr>
+              <w:t xml:space="preserve">, </w:t>
+            </w:r>
+            <w:proofErr w:type="spellStart"/>
+            <w:r>
+              <w:rPr>
+                <w:lang w:val="en-US"/>
+              </w:rPr>
+              <w:t>trạng</w:t>
+            </w:r>
+            <w:proofErr w:type="spellEnd"/>
+            <w:r>
+              <w:rPr>
+                <w:lang w:val="en-US"/>
+              </w:rPr>
+              <w:t xml:space="preserve"> </w:t>
+            </w:r>
+            <w:proofErr w:type="spellStart"/>
+            <w:r>
+              <w:rPr>
+                <w:lang w:val="en-US"/>
+              </w:rPr>
+              <w:t>thái</w:t>
+            </w:r>
+            <w:proofErr w:type="spellEnd"/>
+            <w:r>
+              <w:rPr>
+                <w:lang w:val="en-US"/>
+              </w:rPr>
+              <w:t xml:space="preserve"> </w:t>
+            </w:r>
+            <w:proofErr w:type="spellStart"/>
+            <w:r>
+              <w:rPr>
+                <w:lang w:val="en-US"/>
+              </w:rPr>
+              <w:t>lệ</w:t>
+            </w:r>
+            <w:proofErr w:type="spellEnd"/>
+            <w:r>
+              <w:rPr>
+                <w:lang w:val="en-US"/>
+              </w:rPr>
+              <w:t xml:space="preserve"> </w:t>
+            </w:r>
+            <w:proofErr w:type="spellStart"/>
+            <w:r>
+              <w:rPr>
+                <w:lang w:val="en-US"/>
+              </w:rPr>
+              <w:t>phí</w:t>
+            </w:r>
+            <w:proofErr w:type="spellEnd"/>
+          </w:p>
+        </w:tc>
+        <w:tc>
+          <w:tcPr>
+            <w:tcW w:w="2890" w:type="dxa"/>
+            <w:hideMark/>
+          </w:tcPr>
+          <w:p>
+            <w:pPr>
+              <w:spacing w:after="120" w:line="300" w:lineRule="auto"/>
+              <w:ind w:firstLine="425"/>
+              <w:jc w:val="both"/>
+              <w:cnfStyle w:val="000000000000" w:firstRow="0" w:lastRow="0" w:firstColumn="0" w:lastColumn="0" w:oddVBand="0" w:evenVBand="0" w:oddHBand="0" w:evenHBand="0" w:firstRowFirstColumn="0" w:firstRowLastColumn="0" w:lastRowFirstColumn="0" w:lastRowLastColumn="0"/>
+              <w:rPr>
+                <w:lang w:val="en-US"/>
+              </w:rPr>
+            </w:pPr>
+            <w:proofErr w:type="spellStart"/>
+            <w:r>
+              <w:rPr>
+                <w:lang w:val="en-US"/>
+              </w:rPr>
+              <w:t>Cấp</w:t>
+            </w:r>
+            <w:proofErr w:type="spellEnd"/>
+            <w:r>
+              <w:rPr>
+                <w:lang w:val="en-US"/>
+              </w:rPr>
+              <w:t xml:space="preserve"> </w:t>
+            </w:r>
+            <w:proofErr w:type="spellStart"/>
+            <w:r>
+              <w:rPr>
+                <w:lang w:val="en-US"/>
+              </w:rPr>
+              <w:t>hồ</w:t>
+            </w:r>
+            <w:proofErr w:type="spellEnd"/>
+            <w:r>
+              <w:rPr>
+                <w:lang w:val="en-US"/>
+              </w:rPr>
+              <w:t xml:space="preserve"> </w:t>
+            </w:r>
+            <w:proofErr w:type="spellStart"/>
+            <w:proofErr w:type="gramStart"/>
+            <w:r>
+              <w:rPr>
+                <w:lang w:val="en-US"/>
+              </w:rPr>
+              <w:t>sơ</w:t>
+            </w:r>
+            <w:proofErr w:type="spellEnd"/>
+            <w:r>
+              <w:rPr>
+                <w:lang w:val="en-US"/>
+              </w:rPr>
+              <w:t>(</w:t>
+            </w:r>
+            <w:proofErr w:type="gramEnd"/>
+            <w:r>
+              <w:rPr>
+                <w:lang w:val="en-US"/>
+              </w:rPr>
+              <w:t xml:space="preserve">), </w:t>
+            </w:r>
+            <w:proofErr w:type="spellStart"/>
+            <w:r>
+              <w:rPr>
+                <w:lang w:val="en-US"/>
+              </w:rPr>
+              <w:t>Kiểm</w:t>
+            </w:r>
+            <w:proofErr w:type="spellEnd"/>
+            <w:r>
+              <w:rPr>
+                <w:lang w:val="en-US"/>
+              </w:rPr>
+              <w:t xml:space="preserve"> </w:t>
+            </w:r>
+            <w:proofErr w:type="spellStart"/>
+            <w:r>
+              <w:rPr>
+                <w:lang w:val="en-US"/>
+              </w:rPr>
+              <w:t>tra</w:t>
+            </w:r>
+            <w:proofErr w:type="spellEnd"/>
+            <w:r>
+              <w:rPr>
+                <w:lang w:val="en-US"/>
+              </w:rPr>
+              <w:t xml:space="preserve"> </w:t>
+            </w:r>
+            <w:proofErr w:type="spellStart"/>
+            <w:r>
+              <w:rPr>
+                <w:lang w:val="en-US"/>
+              </w:rPr>
+              <w:t>hiệu</w:t>
+            </w:r>
+            <w:proofErr w:type="spellEnd"/>
+            <w:r>
+              <w:rPr>
+                <w:lang w:val="en-US"/>
+              </w:rPr>
+              <w:t xml:space="preserve"> </w:t>
+            </w:r>
+            <w:proofErr w:type="spellStart"/>
+            <w:proofErr w:type="gramStart"/>
+            <w:r>
+              <w:rPr>
+                <w:lang w:val="en-US"/>
+              </w:rPr>
+              <w:t>lực</w:t>
+            </w:r>
+            <w:proofErr w:type="spellEnd"/>
+            <w:r>
+              <w:rPr>
+                <w:lang w:val="en-US"/>
+              </w:rPr>
+              <w:t>(</w:t>
+            </w:r>
+            <w:proofErr w:type="gramEnd"/>
+            <w:r>
+              <w:rPr>
+                <w:lang w:val="en-US"/>
+              </w:rPr>
+              <w:t xml:space="preserve">), Tra </w:t>
+            </w:r>
+            <w:proofErr w:type="spellStart"/>
+            <w:r>
+              <w:rPr>
+                <w:lang w:val="en-US"/>
+              </w:rPr>
+              <w:t>cứu</w:t>
+            </w:r>
+            <w:proofErr w:type="spellEnd"/>
+            <w:r>
+              <w:rPr>
+                <w:lang w:val="en-US"/>
+              </w:rPr>
+              <w:t xml:space="preserve"> </w:t>
+            </w:r>
+            <w:proofErr w:type="spellStart"/>
+            <w:r>
+              <w:rPr>
+                <w:lang w:val="en-US"/>
+              </w:rPr>
+              <w:t>lịch</w:t>
+            </w:r>
+            <w:proofErr w:type="spellEnd"/>
+            <w:r>
+              <w:rPr>
+                <w:lang w:val="en-US"/>
+              </w:rPr>
+              <w:t xml:space="preserve"> </w:t>
+            </w:r>
+            <w:proofErr w:type="spellStart"/>
+            <w:proofErr w:type="gramStart"/>
+            <w:r>
+              <w:rPr>
+                <w:lang w:val="en-US"/>
+              </w:rPr>
+              <w:t>sử</w:t>
+            </w:r>
+            <w:proofErr w:type="spellEnd"/>
+            <w:r>
+              <w:rPr>
+                <w:lang w:val="en-US"/>
+              </w:rPr>
+              <w:t>(</w:t>
+            </w:r>
+            <w:proofErr w:type="gramEnd"/>
+            <w:r>
+              <w:rPr>
+                <w:lang w:val="en-US"/>
+              </w:rPr>
+              <w:t>)</w:t>
+            </w:r>
+          </w:p>
+        </w:tc>
+      </w:tr>
+      <w:tr>
+        <w:trPr>
+          <w:cnfStyle w:val="000000100000" w:firstRow="0" w:lastRow="0" w:firstColumn="0" w:lastColumn="0" w:oddVBand="0" w:evenVBand="0" w:oddHBand="1" w:evenHBand="0" w:firstRowFirstColumn="0" w:firstRowLastColumn="0" w:lastRowFirstColumn="0" w:lastRowLastColumn="0"/>
+        </w:trPr>
+        <w:tc>
+          <w:tcPr>
+            <w:cnfStyle w:val="001000000000" w:firstRow="0" w:lastRow="0" w:firstColumn="1" w:lastColumn="0" w:oddVBand="0" w:evenVBand="0" w:oddHBand="0" w:evenHBand="0" w:firstRowFirstColumn="0" w:firstRowLastColumn="0" w:lastRowFirstColumn="0" w:lastRowLastColumn="0"/>
+            <w:tcW w:w="1823" w:type="dxa"/>
+            <w:hideMark/>
+          </w:tcPr>
+          <w:p>
+            <w:pPr>
+              <w:spacing w:after="120" w:line="300" w:lineRule="auto"/>
+              <w:ind w:firstLine="425"/>
+              <w:jc w:val="both"/>
+              <w:rPr>
+                <w:lang w:val="en-US"/>
+              </w:rPr>
+            </w:pPr>
+            <w:proofErr w:type="spellStart"/>
+            <w:r>
+              <w:rPr>
+                <w:lang w:val="en-US"/>
+              </w:rPr>
+              <w:t>Bác</w:t>
+            </w:r>
+            <w:proofErr w:type="spellEnd"/>
+            <w:r>
+              <w:rPr>
+                <w:lang w:val="en-US"/>
+              </w:rPr>
+              <w:t xml:space="preserve"> </w:t>
+            </w:r>
+            <w:proofErr w:type="spellStart"/>
+            <w:r>
+              <w:rPr>
+                <w:lang w:val="en-US"/>
+              </w:rPr>
+              <w:t>sĩ</w:t>
+            </w:r>
+            <w:proofErr w:type="spellEnd"/>
+          </w:p>
+        </w:tc>
+        <w:tc>
+          <w:tcPr>
+            <w:tcW w:w="1387" w:type="dxa"/>
+            <w:hideMark/>
+          </w:tcPr>
+          <w:p>
+            <w:pPr>
+              <w:spacing w:after="120" w:line="300" w:lineRule="auto"/>
+              <w:ind w:firstLine="425"/>
+              <w:jc w:val="both"/>
+              <w:cnfStyle w:val="000000100000" w:firstRow="0" w:lastRow="0" w:firstColumn="0" w:lastColumn="0" w:oddVBand="0" w:evenVBand="0" w:oddHBand="1" w:evenHBand="0" w:firstRowFirstColumn="0" w:firstRowLastColumn="0" w:lastRowFirstColumn="0" w:lastRowLastColumn="0"/>
+              <w:rPr>
+                <w:lang w:val="en-US"/>
+              </w:rPr>
+            </w:pPr>
+            <w:proofErr w:type="spellStart"/>
+            <w:r>
+              <w:rPr>
+                <w:lang w:val="en-US"/>
+              </w:rPr>
+              <w:t>Mã</w:t>
+            </w:r>
+            <w:proofErr w:type="spellEnd"/>
+            <w:r>
+              <w:rPr>
+                <w:lang w:val="en-US"/>
+              </w:rPr>
+              <w:t xml:space="preserve"> </w:t>
+            </w:r>
+            <w:proofErr w:type="spellStart"/>
+            <w:r>
+              <w:rPr>
+                <w:lang w:val="en-US"/>
+              </w:rPr>
+              <w:t>bác</w:t>
+            </w:r>
+            <w:proofErr w:type="spellEnd"/>
+            <w:r>
+              <w:rPr>
+                <w:lang w:val="en-US"/>
+              </w:rPr>
+              <w:t xml:space="preserve"> </w:t>
+            </w:r>
+            <w:proofErr w:type="spellStart"/>
+            <w:r>
+              <w:rPr>
+                <w:lang w:val="en-US"/>
+              </w:rPr>
+              <w:t>sĩ</w:t>
+            </w:r>
+            <w:proofErr w:type="spellEnd"/>
+          </w:p>
+        </w:tc>
+        <w:tc>
+          <w:tcPr>
+            <w:tcW w:w="3579" w:type="dxa"/>
+            <w:hideMark/>
+          </w:tcPr>
+          <w:p>
+            <w:pPr>
+              <w:spacing w:after="120" w:line="300" w:lineRule="auto"/>
+              <w:ind w:firstLine="425"/>
+              <w:jc w:val="both"/>
+              <w:cnfStyle w:val="000000100000" w:firstRow="0" w:lastRow="0" w:firstColumn="0" w:lastColumn="0" w:oddVBand="0" w:evenVBand="0" w:oddHBand="1" w:evenHBand="0" w:firstRowFirstColumn="0" w:firstRowLastColumn="0" w:lastRowFirstColumn="0" w:lastRowLastColumn="0"/>
+              <w:rPr>
+                <w:lang w:val="en-US"/>
+              </w:rPr>
+            </w:pPr>
+            <w:proofErr w:type="spellStart"/>
+            <w:r>
+              <w:rPr>
+                <w:lang w:val="en-US"/>
+              </w:rPr>
+              <w:t>Họ</w:t>
+            </w:r>
+            <w:proofErr w:type="spellEnd"/>
+            <w:r>
+              <w:rPr>
+                <w:lang w:val="en-US"/>
+              </w:rPr>
+              <w:t xml:space="preserve"> </w:t>
+            </w:r>
+            <w:proofErr w:type="spellStart"/>
+            <w:r>
+              <w:rPr>
+                <w:lang w:val="en-US"/>
+              </w:rPr>
+              <w:t>tên</w:t>
+            </w:r>
+            <w:proofErr w:type="spellEnd"/>
+            <w:r>
+              <w:rPr>
+                <w:lang w:val="en-US"/>
+              </w:rPr>
+              <w:t xml:space="preserve">, khoa, </w:t>
+            </w:r>
+            <w:proofErr w:type="spellStart"/>
+            <w:r>
+              <w:rPr>
+                <w:lang w:val="en-US"/>
+              </w:rPr>
+              <w:t>chuyên</w:t>
+            </w:r>
+            <w:proofErr w:type="spellEnd"/>
+            <w:r>
+              <w:rPr>
+                <w:lang w:val="en-US"/>
+              </w:rPr>
+              <w:t xml:space="preserve"> </w:t>
+            </w:r>
+            <w:proofErr w:type="spellStart"/>
+            <w:r>
+              <w:rPr>
+                <w:lang w:val="en-US"/>
+              </w:rPr>
+              <w:t>môn</w:t>
+            </w:r>
+            <w:proofErr w:type="spellEnd"/>
+          </w:p>
+        </w:tc>
+        <w:tc>
+          <w:tcPr>
+            <w:tcW w:w="2890" w:type="dxa"/>
+            <w:hideMark/>
+          </w:tcPr>
+          <w:p>
+            <w:pPr>
+              <w:spacing w:after="120" w:line="300" w:lineRule="auto"/>
+              <w:ind w:firstLine="425"/>
+              <w:jc w:val="both"/>
+              <w:cnfStyle w:val="000000100000" w:firstRow="0" w:lastRow="0" w:firstColumn="0" w:lastColumn="0" w:oddVBand="0" w:evenVBand="0" w:oddHBand="1" w:evenHBand="0" w:firstRowFirstColumn="0" w:firstRowLastColumn="0" w:lastRowFirstColumn="0" w:lastRowLastColumn="0"/>
+              <w:rPr>
+                <w:lang w:val="en-US"/>
+              </w:rPr>
+            </w:pPr>
+            <w:proofErr w:type="spellStart"/>
+            <w:r>
+              <w:rPr>
+                <w:lang w:val="en-US"/>
+              </w:rPr>
+              <w:t>Khám</w:t>
+            </w:r>
+            <w:proofErr w:type="spellEnd"/>
+            <w:r>
+              <w:rPr>
+                <w:lang w:val="en-US"/>
+              </w:rPr>
+              <w:t xml:space="preserve"> </w:t>
+            </w:r>
+            <w:proofErr w:type="spellStart"/>
+            <w:proofErr w:type="gramStart"/>
+            <w:r>
+              <w:rPr>
+                <w:lang w:val="en-US"/>
+              </w:rPr>
+              <w:t>bệnh</w:t>
+            </w:r>
+            <w:proofErr w:type="spellEnd"/>
+            <w:r>
+              <w:rPr>
+                <w:lang w:val="en-US"/>
+              </w:rPr>
+              <w:t>(</w:t>
+            </w:r>
+            <w:proofErr w:type="gramEnd"/>
+            <w:r>
+              <w:rPr>
+                <w:lang w:val="en-US"/>
+              </w:rPr>
+              <w:t xml:space="preserve">), </w:t>
+            </w:r>
+            <w:proofErr w:type="spellStart"/>
+            <w:r>
+              <w:rPr>
+                <w:lang w:val="en-US"/>
+              </w:rPr>
+              <w:t>Lập</w:t>
+            </w:r>
+            <w:proofErr w:type="spellEnd"/>
+            <w:r>
+              <w:rPr>
+                <w:lang w:val="en-US"/>
+              </w:rPr>
+              <w:t xml:space="preserve"> </w:t>
+            </w:r>
+            <w:proofErr w:type="gramStart"/>
+            <w:r>
+              <w:rPr>
+                <w:lang w:val="en-US"/>
+              </w:rPr>
+              <w:t>toa(</w:t>
+            </w:r>
+            <w:proofErr w:type="gramEnd"/>
+            <w:r>
+              <w:rPr>
+                <w:lang w:val="en-US"/>
+              </w:rPr>
+              <w:t>)</w:t>
+            </w:r>
+          </w:p>
+        </w:tc>
+      </w:tr>
+      <w:tr>
+        <w:tc>
+          <w:tcPr>
+            <w:cnfStyle w:val="001000000000" w:firstRow="0" w:lastRow="0" w:firstColumn="1" w:lastColumn="0" w:oddVBand="0" w:evenVBand="0" w:oddHBand="0" w:evenHBand="0" w:firstRowFirstColumn="0" w:firstRowLastColumn="0" w:lastRowFirstColumn="0" w:lastRowLastColumn="0"/>
+            <w:tcW w:w="1823" w:type="dxa"/>
+            <w:hideMark/>
+          </w:tcPr>
+          <w:p>
+            <w:pPr>
+              <w:spacing w:after="120" w:line="300" w:lineRule="auto"/>
+              <w:ind w:firstLine="425"/>
+              <w:jc w:val="both"/>
+              <w:rPr>
+                <w:lang w:val="en-US"/>
+              </w:rPr>
+            </w:pPr>
+            <w:proofErr w:type="spellStart"/>
+            <w:r>
+              <w:rPr>
+                <w:lang w:val="en-US"/>
+              </w:rPr>
+              <w:t>Lịch</w:t>
+            </w:r>
+            <w:proofErr w:type="spellEnd"/>
+            <w:r>
+              <w:rPr>
+                <w:lang w:val="en-US"/>
+              </w:rPr>
+              <w:t xml:space="preserve"> </w:t>
+            </w:r>
+            <w:proofErr w:type="spellStart"/>
+            <w:r>
+              <w:rPr>
+                <w:lang w:val="en-US"/>
+              </w:rPr>
+              <w:t>hẹn</w:t>
+            </w:r>
+            <w:proofErr w:type="spellEnd"/>
+          </w:p>
+        </w:tc>
+        <w:tc>
+          <w:tcPr>
+            <w:tcW w:w="1387" w:type="dxa"/>
+            <w:hideMark/>
+          </w:tcPr>
+          <w:p>
+            <w:pPr>
+              <w:spacing w:after="120" w:line="300" w:lineRule="auto"/>
+              <w:ind w:firstLine="425"/>
+              <w:jc w:val="both"/>
+              <w:cnfStyle w:val="000000000000" w:firstRow="0" w:lastRow="0" w:firstColumn="0" w:lastColumn="0" w:oddVBand="0" w:evenVBand="0" w:oddHBand="0" w:evenHBand="0" w:firstRowFirstColumn="0" w:firstRowLastColumn="0" w:lastRowFirstColumn="0" w:lastRowLastColumn="0"/>
+              <w:rPr>
+                <w:lang w:val="en-US"/>
+              </w:rPr>
+            </w:pPr>
+            <w:proofErr w:type="spellStart"/>
+            <w:r>
+              <w:rPr>
+                <w:lang w:val="en-US"/>
+              </w:rPr>
+              <w:t>Mã</w:t>
+            </w:r>
+            <w:proofErr w:type="spellEnd"/>
+            <w:r>
+              <w:rPr>
+                <w:lang w:val="en-US"/>
+              </w:rPr>
+              <w:t xml:space="preserve"> </w:t>
+            </w:r>
+            <w:proofErr w:type="spellStart"/>
+            <w:r>
+              <w:rPr>
+                <w:lang w:val="en-US"/>
+              </w:rPr>
+              <w:t>lịch</w:t>
+            </w:r>
+            <w:proofErr w:type="spellEnd"/>
+            <w:r>
+              <w:rPr>
+                <w:lang w:val="en-US"/>
+              </w:rPr>
+              <w:t xml:space="preserve"> </w:t>
+            </w:r>
+            <w:proofErr w:type="spellStart"/>
+            <w:r>
+              <w:rPr>
+                <w:lang w:val="en-US"/>
+              </w:rPr>
+              <w:t>hẹn</w:t>
+            </w:r>
+            <w:proofErr w:type="spellEnd"/>
+          </w:p>
+        </w:tc>
+        <w:tc>
+          <w:tcPr>
+            <w:tcW w:w="3579" w:type="dxa"/>
+            <w:hideMark/>
+          </w:tcPr>
+          <w:p>
+            <w:pPr>
+              <w:spacing w:after="120" w:line="300" w:lineRule="auto"/>
+              <w:ind w:firstLine="425"/>
+              <w:jc w:val="both"/>
+              <w:cnfStyle w:val="000000000000" w:firstRow="0" w:lastRow="0" w:firstColumn="0" w:lastColumn="0" w:oddVBand="0" w:evenVBand="0" w:oddHBand="0" w:evenHBand="0" w:firstRowFirstColumn="0" w:firstRowLastColumn="0" w:lastRowFirstColumn="0" w:lastRowLastColumn="0"/>
+              <w:rPr>
+                <w:lang w:val="en-US"/>
+              </w:rPr>
+            </w:pPr>
+            <w:proofErr w:type="spellStart"/>
+            <w:r>
+              <w:rPr>
+                <w:lang w:val="en-US"/>
+              </w:rPr>
+              <w:t>Mã</w:t>
+            </w:r>
+            <w:proofErr w:type="spellEnd"/>
+            <w:r>
+              <w:rPr>
+                <w:lang w:val="en-US"/>
+              </w:rPr>
+              <w:t xml:space="preserve"> </w:t>
+            </w:r>
+            <w:proofErr w:type="spellStart"/>
+            <w:r>
+              <w:rPr>
+                <w:lang w:val="en-US"/>
+              </w:rPr>
+              <w:t>hồ</w:t>
+            </w:r>
+            <w:proofErr w:type="spellEnd"/>
+            <w:r>
+              <w:rPr>
+                <w:lang w:val="en-US"/>
+              </w:rPr>
+              <w:t xml:space="preserve"> </w:t>
+            </w:r>
+            <w:proofErr w:type="spellStart"/>
+            <w:r>
+              <w:rPr>
+                <w:lang w:val="en-US"/>
+              </w:rPr>
+              <w:t>sơ</w:t>
+            </w:r>
+            <w:proofErr w:type="spellEnd"/>
+            <w:r>
+              <w:rPr>
+                <w:lang w:val="en-US"/>
+              </w:rPr>
+              <w:t xml:space="preserve">, </w:t>
+            </w:r>
+            <w:proofErr w:type="spellStart"/>
+            <w:r>
+              <w:rPr>
+                <w:lang w:val="en-US"/>
+              </w:rPr>
+              <w:t>ngày</w:t>
+            </w:r>
+            <w:proofErr w:type="spellEnd"/>
+            <w:r>
+              <w:rPr>
+                <w:lang w:val="en-US"/>
+              </w:rPr>
+              <w:t xml:space="preserve"> </w:t>
+            </w:r>
+            <w:proofErr w:type="spellStart"/>
+            <w:r>
+              <w:rPr>
+                <w:lang w:val="en-US"/>
+              </w:rPr>
+              <w:t>giờ</w:t>
+            </w:r>
+            <w:proofErr w:type="spellEnd"/>
+            <w:r>
+              <w:rPr>
+                <w:lang w:val="en-US"/>
+              </w:rPr>
+              <w:t xml:space="preserve"> </w:t>
+            </w:r>
+            <w:proofErr w:type="spellStart"/>
+            <w:r>
+              <w:rPr>
+                <w:lang w:val="en-US"/>
+              </w:rPr>
+              <w:t>hẹn</w:t>
+            </w:r>
+            <w:proofErr w:type="spellEnd"/>
+            <w:r>
+              <w:rPr>
+                <w:lang w:val="en-US"/>
+              </w:rPr>
+              <w:t xml:space="preserve">, </w:t>
+            </w:r>
+            <w:proofErr w:type="spellStart"/>
+            <w:r>
+              <w:rPr>
+                <w:lang w:val="en-US"/>
+              </w:rPr>
+              <w:t>loại</w:t>
+            </w:r>
+            <w:proofErr w:type="spellEnd"/>
+            <w:r>
+              <w:rPr>
+                <w:lang w:val="en-US"/>
+              </w:rPr>
+              <w:t xml:space="preserve"> </w:t>
+            </w:r>
+            <w:proofErr w:type="spellStart"/>
+            <w:r>
+              <w:rPr>
+                <w:lang w:val="en-US"/>
+              </w:rPr>
+              <w:t>hẹn</w:t>
+            </w:r>
+            <w:proofErr w:type="spellEnd"/>
+            <w:r>
+              <w:rPr>
+                <w:lang w:val="en-US"/>
+              </w:rPr>
+              <w:t xml:space="preserve">, </w:t>
+            </w:r>
+            <w:proofErr w:type="spellStart"/>
+            <w:r>
+              <w:rPr>
+                <w:lang w:val="en-US"/>
+              </w:rPr>
+              <w:t>trạng</w:t>
+            </w:r>
+            <w:proofErr w:type="spellEnd"/>
+            <w:r>
+              <w:rPr>
+                <w:lang w:val="en-US"/>
+              </w:rPr>
+              <w:t xml:space="preserve"> </w:t>
+            </w:r>
+            <w:proofErr w:type="spellStart"/>
+            <w:r>
+              <w:rPr>
+                <w:lang w:val="en-US"/>
+              </w:rPr>
+              <w:t>thái</w:t>
+            </w:r>
+            <w:proofErr w:type="spellEnd"/>
+          </w:p>
+        </w:tc>
+        <w:tc>
+          <w:tcPr>
+            <w:tcW w:w="2890" w:type="dxa"/>
+            <w:hideMark/>
+          </w:tcPr>
+          <w:p>
+            <w:pPr>
+              <w:spacing w:after="120" w:line="300" w:lineRule="auto"/>
+              <w:ind w:firstLine="425"/>
+              <w:jc w:val="both"/>
+              <w:cnfStyle w:val="000000000000" w:firstRow="0" w:lastRow="0" w:firstColumn="0" w:lastColumn="0" w:oddVBand="0" w:evenVBand="0" w:oddHBand="0" w:evenHBand="0" w:firstRowFirstColumn="0" w:firstRowLastColumn="0" w:lastRowFirstColumn="0" w:lastRowLastColumn="0"/>
+              <w:rPr>
+                <w:lang w:val="en-US"/>
+              </w:rPr>
+            </w:pPr>
+            <w:proofErr w:type="spellStart"/>
+            <w:r>
+              <w:rPr>
+                <w:lang w:val="en-US"/>
+              </w:rPr>
+              <w:t>Đặt</w:t>
+            </w:r>
+            <w:proofErr w:type="spellEnd"/>
+            <w:r>
+              <w:rPr>
+                <w:lang w:val="en-US"/>
+              </w:rPr>
+              <w:t xml:space="preserve"> </w:t>
+            </w:r>
+            <w:proofErr w:type="spellStart"/>
+            <w:proofErr w:type="gramStart"/>
+            <w:r>
+              <w:rPr>
+                <w:lang w:val="en-US"/>
+              </w:rPr>
+              <w:t>lịch</w:t>
+            </w:r>
+            <w:proofErr w:type="spellEnd"/>
+            <w:r>
+              <w:rPr>
+                <w:lang w:val="en-US"/>
+              </w:rPr>
+              <w:t>(</w:t>
+            </w:r>
+            <w:proofErr w:type="gramEnd"/>
+            <w:r>
+              <w:rPr>
+                <w:lang w:val="en-US"/>
+              </w:rPr>
+              <w:t xml:space="preserve">), </w:t>
+            </w:r>
+            <w:proofErr w:type="spellStart"/>
+            <w:r>
+              <w:rPr>
+                <w:lang w:val="en-US"/>
+              </w:rPr>
+              <w:t>Kiểm</w:t>
+            </w:r>
+            <w:proofErr w:type="spellEnd"/>
+            <w:r>
+              <w:rPr>
+                <w:lang w:val="en-US"/>
+              </w:rPr>
+              <w:t xml:space="preserve"> </w:t>
+            </w:r>
+            <w:proofErr w:type="spellStart"/>
+            <w:r>
+              <w:rPr>
+                <w:lang w:val="en-US"/>
+              </w:rPr>
+              <w:t>tra</w:t>
+            </w:r>
+            <w:proofErr w:type="spellEnd"/>
+            <w:r>
+              <w:rPr>
+                <w:lang w:val="en-US"/>
+              </w:rPr>
+              <w:t xml:space="preserve"> </w:t>
+            </w:r>
+            <w:proofErr w:type="spellStart"/>
+            <w:r>
+              <w:rPr>
+                <w:lang w:val="en-US"/>
+              </w:rPr>
+              <w:t>trùng</w:t>
+            </w:r>
+            <w:proofErr w:type="spellEnd"/>
+            <w:r>
+              <w:rPr>
+                <w:lang w:val="en-US"/>
+              </w:rPr>
+              <w:t xml:space="preserve"> </w:t>
+            </w:r>
+            <w:proofErr w:type="spellStart"/>
+            <w:proofErr w:type="gramStart"/>
+            <w:r>
+              <w:rPr>
+                <w:lang w:val="en-US"/>
+              </w:rPr>
+              <w:t>lịch</w:t>
+            </w:r>
+            <w:proofErr w:type="spellEnd"/>
+            <w:r>
+              <w:rPr>
+                <w:lang w:val="en-US"/>
+              </w:rPr>
+              <w:t>(</w:t>
+            </w:r>
+            <w:proofErr w:type="gramEnd"/>
+            <w:r>
+              <w:rPr>
+                <w:lang w:val="en-US"/>
+              </w:rPr>
+              <w:t xml:space="preserve">), </w:t>
+            </w:r>
+            <w:proofErr w:type="spellStart"/>
+            <w:r>
+              <w:rPr>
+                <w:lang w:val="en-US"/>
+              </w:rPr>
+              <w:t>Hủy</w:t>
+            </w:r>
+            <w:proofErr w:type="spellEnd"/>
+            <w:r>
+              <w:rPr>
+                <w:lang w:val="en-US"/>
+              </w:rPr>
+              <w:t xml:space="preserve"> </w:t>
+            </w:r>
+            <w:proofErr w:type="spellStart"/>
+            <w:proofErr w:type="gramStart"/>
+            <w:r>
+              <w:rPr>
+                <w:lang w:val="en-US"/>
+              </w:rPr>
+              <w:t>lịch</w:t>
+            </w:r>
+            <w:proofErr w:type="spellEnd"/>
+            <w:r>
+              <w:rPr>
+                <w:lang w:val="en-US"/>
+              </w:rPr>
+              <w:t>(</w:t>
+            </w:r>
+            <w:proofErr w:type="gramEnd"/>
+            <w:r>
+              <w:rPr>
+                <w:lang w:val="en-US"/>
+              </w:rPr>
+              <w:t>)</w:t>
+            </w:r>
+          </w:p>
+        </w:tc>
+      </w:tr>
+      <w:tr>
+        <w:trPr>
+          <w:cnfStyle w:val="000000100000" w:firstRow="0" w:lastRow="0" w:firstColumn="0" w:lastColumn="0" w:oddVBand="0" w:evenVBand="0" w:oddHBand="1" w:evenHBand="0" w:firstRowFirstColumn="0" w:firstRowLastColumn="0" w:lastRowFirstColumn="0" w:lastRowLastColumn="0"/>
+        </w:trPr>
+        <w:tc>
+          <w:tcPr>
+            <w:cnfStyle w:val="001000000000" w:firstRow="0" w:lastRow="0" w:firstColumn="1" w:lastColumn="0" w:oddVBand="0" w:evenVBand="0" w:oddHBand="0" w:evenHBand="0" w:firstRowFirstColumn="0" w:firstRowLastColumn="0" w:lastRowFirstColumn="0" w:lastRowLastColumn="0"/>
+            <w:tcW w:w="1823" w:type="dxa"/>
+            <w:hideMark/>
+          </w:tcPr>
+          <w:p>
+            <w:pPr>
+              <w:spacing w:after="120" w:line="300" w:lineRule="auto"/>
+              <w:ind w:firstLine="425"/>
+              <w:jc w:val="both"/>
+              <w:rPr>
+                <w:lang w:val="en-US"/>
+              </w:rPr>
+            </w:pPr>
+            <w:proofErr w:type="spellStart"/>
+            <w:r>
+              <w:rPr>
+                <w:lang w:val="en-US"/>
+              </w:rPr>
+              <w:lastRenderedPageBreak/>
+              <w:t>Phiếu</w:t>
+            </w:r>
+            <w:proofErr w:type="spellEnd"/>
+            <w:r>
+              <w:rPr>
+                <w:lang w:val="en-US"/>
+              </w:rPr>
+              <w:t xml:space="preserve"> </w:t>
+            </w:r>
+            <w:proofErr w:type="spellStart"/>
+            <w:r>
+              <w:rPr>
+                <w:lang w:val="en-US"/>
+              </w:rPr>
+              <w:t>khám</w:t>
+            </w:r>
+            <w:proofErr w:type="spellEnd"/>
+          </w:p>
+        </w:tc>
+        <w:tc>
+          <w:tcPr>
+            <w:tcW w:w="1387" w:type="dxa"/>
+            <w:hideMark/>
+          </w:tcPr>
+          <w:p>
+            <w:pPr>
+              <w:spacing w:after="120" w:line="300" w:lineRule="auto"/>
+              <w:ind w:firstLine="425"/>
+              <w:jc w:val="both"/>
+              <w:cnfStyle w:val="000000100000" w:firstRow="0" w:lastRow="0" w:firstColumn="0" w:lastColumn="0" w:oddVBand="0" w:evenVBand="0" w:oddHBand="1" w:evenHBand="0" w:firstRowFirstColumn="0" w:firstRowLastColumn="0" w:lastRowFirstColumn="0" w:lastRowLastColumn="0"/>
+              <w:rPr>
+                <w:lang w:val="en-US"/>
+              </w:rPr>
+            </w:pPr>
+            <w:proofErr w:type="spellStart"/>
+            <w:r>
+              <w:rPr>
+                <w:lang w:val="en-US"/>
+              </w:rPr>
+              <w:t>Mã</w:t>
+            </w:r>
+            <w:proofErr w:type="spellEnd"/>
+            <w:r>
+              <w:rPr>
+                <w:lang w:val="en-US"/>
+              </w:rPr>
+              <w:t xml:space="preserve"> </w:t>
+            </w:r>
+            <w:proofErr w:type="spellStart"/>
+            <w:r>
+              <w:rPr>
+                <w:lang w:val="en-US"/>
+              </w:rPr>
+              <w:t>phiếu</w:t>
+            </w:r>
+            <w:proofErr w:type="spellEnd"/>
+            <w:r>
+              <w:rPr>
+                <w:lang w:val="en-US"/>
+              </w:rPr>
+              <w:t xml:space="preserve"> </w:t>
+            </w:r>
+            <w:proofErr w:type="spellStart"/>
+            <w:r>
+              <w:rPr>
+                <w:lang w:val="en-US"/>
+              </w:rPr>
+              <w:t>khám</w:t>
+            </w:r>
+            <w:proofErr w:type="spellEnd"/>
+          </w:p>
+        </w:tc>
+        <w:tc>
+          <w:tcPr>
+            <w:tcW w:w="3579" w:type="dxa"/>
+            <w:hideMark/>
+          </w:tcPr>
+          <w:p>
+            <w:pPr>
+              <w:spacing w:after="120" w:line="300" w:lineRule="auto"/>
+              <w:ind w:firstLine="425"/>
+              <w:jc w:val="both"/>
+              <w:cnfStyle w:val="000000100000" w:firstRow="0" w:lastRow="0" w:firstColumn="0" w:lastColumn="0" w:oddVBand="0" w:evenVBand="0" w:oddHBand="1" w:evenHBand="0" w:firstRowFirstColumn="0" w:firstRowLastColumn="0" w:lastRowFirstColumn="0" w:lastRowLastColumn="0"/>
+              <w:rPr>
+                <w:lang w:val="en-US"/>
+              </w:rPr>
+            </w:pPr>
+            <w:proofErr w:type="spellStart"/>
+            <w:r>
+              <w:rPr>
+                <w:lang w:val="en-US"/>
+              </w:rPr>
+              <w:t>Mã</w:t>
+            </w:r>
+            <w:proofErr w:type="spellEnd"/>
+            <w:r>
+              <w:rPr>
+                <w:lang w:val="en-US"/>
+              </w:rPr>
+              <w:t xml:space="preserve"> </w:t>
+            </w:r>
+            <w:proofErr w:type="spellStart"/>
+            <w:r>
+              <w:rPr>
+                <w:lang w:val="en-US"/>
+              </w:rPr>
+              <w:t>hồ</w:t>
+            </w:r>
+            <w:proofErr w:type="spellEnd"/>
+            <w:r>
+              <w:rPr>
+                <w:lang w:val="en-US"/>
+              </w:rPr>
+              <w:t xml:space="preserve"> </w:t>
+            </w:r>
+            <w:proofErr w:type="spellStart"/>
+            <w:r>
+              <w:rPr>
+                <w:lang w:val="en-US"/>
+              </w:rPr>
+              <w:t>sơ</w:t>
+            </w:r>
+            <w:proofErr w:type="spellEnd"/>
+            <w:r>
+              <w:rPr>
+                <w:lang w:val="en-US"/>
+              </w:rPr>
+              <w:t xml:space="preserve">, </w:t>
+            </w:r>
+            <w:proofErr w:type="spellStart"/>
+            <w:r>
+              <w:rPr>
+                <w:lang w:val="en-US"/>
+              </w:rPr>
+              <w:t>mã</w:t>
+            </w:r>
+            <w:proofErr w:type="spellEnd"/>
+            <w:r>
+              <w:rPr>
+                <w:lang w:val="en-US"/>
+              </w:rPr>
+              <w:t xml:space="preserve"> </w:t>
+            </w:r>
+            <w:proofErr w:type="spellStart"/>
+            <w:r>
+              <w:rPr>
+                <w:lang w:val="en-US"/>
+              </w:rPr>
+              <w:t>bác</w:t>
+            </w:r>
+            <w:proofErr w:type="spellEnd"/>
+            <w:r>
+              <w:rPr>
+                <w:lang w:val="en-US"/>
+              </w:rPr>
+              <w:t xml:space="preserve"> </w:t>
+            </w:r>
+            <w:proofErr w:type="spellStart"/>
+            <w:r>
+              <w:rPr>
+                <w:lang w:val="en-US"/>
+              </w:rPr>
+              <w:t>sĩ</w:t>
+            </w:r>
+            <w:proofErr w:type="spellEnd"/>
+            <w:r>
+              <w:rPr>
+                <w:lang w:val="en-US"/>
+              </w:rPr>
+              <w:t xml:space="preserve">, </w:t>
+            </w:r>
+            <w:proofErr w:type="spellStart"/>
+            <w:r>
+              <w:rPr>
+                <w:lang w:val="en-US"/>
+              </w:rPr>
+              <w:t>ngày</w:t>
+            </w:r>
+            <w:proofErr w:type="spellEnd"/>
+            <w:r>
+              <w:rPr>
+                <w:lang w:val="en-US"/>
+              </w:rPr>
+              <w:t xml:space="preserve"> </w:t>
+            </w:r>
+            <w:proofErr w:type="spellStart"/>
+            <w:r>
+              <w:rPr>
+                <w:lang w:val="en-US"/>
+              </w:rPr>
+              <w:t>giờ</w:t>
+            </w:r>
+            <w:proofErr w:type="spellEnd"/>
+            <w:r>
+              <w:rPr>
+                <w:lang w:val="en-US"/>
+              </w:rPr>
+              <w:t xml:space="preserve"> </w:t>
+            </w:r>
+            <w:proofErr w:type="spellStart"/>
+            <w:r>
+              <w:rPr>
+                <w:lang w:val="en-US"/>
+              </w:rPr>
+              <w:t>khám</w:t>
+            </w:r>
+            <w:proofErr w:type="spellEnd"/>
+            <w:r>
+              <w:rPr>
+                <w:lang w:val="en-US"/>
+              </w:rPr>
+              <w:t xml:space="preserve">, </w:t>
+            </w:r>
+            <w:proofErr w:type="spellStart"/>
+            <w:r>
+              <w:rPr>
+                <w:lang w:val="en-US"/>
+              </w:rPr>
+              <w:t>triệu</w:t>
+            </w:r>
+            <w:proofErr w:type="spellEnd"/>
+            <w:r>
+              <w:rPr>
+                <w:lang w:val="en-US"/>
+              </w:rPr>
+              <w:t xml:space="preserve"> </w:t>
+            </w:r>
+            <w:proofErr w:type="spellStart"/>
+            <w:r>
+              <w:rPr>
+                <w:lang w:val="en-US"/>
+              </w:rPr>
+              <w:t>chứng</w:t>
+            </w:r>
+            <w:proofErr w:type="spellEnd"/>
+            <w:r>
+              <w:rPr>
+                <w:lang w:val="en-US"/>
+              </w:rPr>
+              <w:t xml:space="preserve">, </w:t>
+            </w:r>
+            <w:proofErr w:type="spellStart"/>
+            <w:r>
+              <w:rPr>
+                <w:lang w:val="en-US"/>
+              </w:rPr>
+              <w:t>chẩn</w:t>
+            </w:r>
+            <w:proofErr w:type="spellEnd"/>
+            <w:r>
+              <w:rPr>
+                <w:lang w:val="en-US"/>
+              </w:rPr>
+              <w:t xml:space="preserve"> </w:t>
+            </w:r>
+            <w:proofErr w:type="spellStart"/>
+            <w:r>
+              <w:rPr>
+                <w:lang w:val="en-US"/>
+              </w:rPr>
+              <w:t>đoán</w:t>
+            </w:r>
+            <w:proofErr w:type="spellEnd"/>
+            <w:r>
+              <w:rPr>
+                <w:lang w:val="en-US"/>
+              </w:rPr>
+              <w:t xml:space="preserve">, </w:t>
+            </w:r>
+            <w:proofErr w:type="spellStart"/>
+            <w:r>
+              <w:rPr>
+                <w:lang w:val="en-US"/>
+              </w:rPr>
+              <w:t>trạng</w:t>
+            </w:r>
+            <w:proofErr w:type="spellEnd"/>
+            <w:r>
+              <w:rPr>
+                <w:lang w:val="en-US"/>
+              </w:rPr>
+              <w:t xml:space="preserve"> </w:t>
+            </w:r>
+            <w:proofErr w:type="spellStart"/>
+            <w:r>
+              <w:rPr>
+                <w:lang w:val="en-US"/>
+              </w:rPr>
+              <w:t>thái</w:t>
+            </w:r>
+            <w:proofErr w:type="spellEnd"/>
+          </w:p>
+        </w:tc>
+        <w:tc>
+          <w:tcPr>
+            <w:tcW w:w="2890" w:type="dxa"/>
+            <w:hideMark/>
+          </w:tcPr>
+          <w:p>
+            <w:pPr>
+              <w:spacing w:after="120" w:line="300" w:lineRule="auto"/>
+              <w:ind w:firstLine="425"/>
+              <w:jc w:val="both"/>
+              <w:cnfStyle w:val="000000100000" w:firstRow="0" w:lastRow="0" w:firstColumn="0" w:lastColumn="0" w:oddVBand="0" w:evenVBand="0" w:oddHBand="1" w:evenHBand="0" w:firstRowFirstColumn="0" w:firstRowLastColumn="0" w:lastRowFirstColumn="0" w:lastRowLastColumn="0"/>
+              <w:rPr>
+                <w:lang w:val="en-US"/>
+              </w:rPr>
+            </w:pPr>
+            <w:proofErr w:type="spellStart"/>
+            <w:r>
+              <w:rPr>
+                <w:lang w:val="en-US"/>
+              </w:rPr>
+              <w:t>Tạo</w:t>
+            </w:r>
+            <w:proofErr w:type="spellEnd"/>
+            <w:r>
+              <w:rPr>
+                <w:lang w:val="en-US"/>
+              </w:rPr>
+              <w:t xml:space="preserve"> </w:t>
+            </w:r>
+            <w:proofErr w:type="spellStart"/>
+            <w:r>
+              <w:rPr>
+                <w:lang w:val="en-US"/>
+              </w:rPr>
+              <w:t>phiếu</w:t>
+            </w:r>
+            <w:proofErr w:type="spellEnd"/>
+            <w:r>
+              <w:rPr>
+                <w:lang w:val="en-US"/>
+              </w:rPr>
+              <w:t xml:space="preserve"> </w:t>
+            </w:r>
+            <w:proofErr w:type="spellStart"/>
+            <w:proofErr w:type="gramStart"/>
+            <w:r>
+              <w:rPr>
+                <w:lang w:val="en-US"/>
+              </w:rPr>
+              <w:t>khám</w:t>
+            </w:r>
+            <w:proofErr w:type="spellEnd"/>
+            <w:r>
+              <w:rPr>
+                <w:lang w:val="en-US"/>
+              </w:rPr>
+              <w:t>(</w:t>
+            </w:r>
+            <w:proofErr w:type="gramEnd"/>
+            <w:r>
+              <w:rPr>
+                <w:lang w:val="en-US"/>
+              </w:rPr>
+              <w:t xml:space="preserve">), </w:t>
+            </w:r>
+            <w:proofErr w:type="spellStart"/>
+            <w:r>
+              <w:rPr>
+                <w:lang w:val="en-US"/>
+              </w:rPr>
+              <w:t>Ghi</w:t>
+            </w:r>
+            <w:proofErr w:type="spellEnd"/>
+            <w:r>
+              <w:rPr>
+                <w:lang w:val="en-US"/>
+              </w:rPr>
+              <w:t xml:space="preserve"> </w:t>
+            </w:r>
+            <w:proofErr w:type="spellStart"/>
+            <w:r>
+              <w:rPr>
+                <w:lang w:val="en-US"/>
+              </w:rPr>
+              <w:t>nhận</w:t>
+            </w:r>
+            <w:proofErr w:type="spellEnd"/>
+            <w:r>
+              <w:rPr>
+                <w:lang w:val="en-US"/>
+              </w:rPr>
+              <w:t xml:space="preserve"> </w:t>
+            </w:r>
+            <w:proofErr w:type="spellStart"/>
+            <w:proofErr w:type="gramStart"/>
+            <w:r>
+              <w:rPr>
+                <w:lang w:val="en-US"/>
+              </w:rPr>
+              <w:t>khám</w:t>
+            </w:r>
+            <w:proofErr w:type="spellEnd"/>
+            <w:r>
+              <w:rPr>
+                <w:lang w:val="en-US"/>
+              </w:rPr>
+              <w:t>(</w:t>
+            </w:r>
+            <w:proofErr w:type="gramEnd"/>
+            <w:r>
+              <w:rPr>
+                <w:lang w:val="en-US"/>
+              </w:rPr>
+              <w:t xml:space="preserve">), Hoàn </w:t>
+            </w:r>
+            <w:proofErr w:type="spellStart"/>
+            <w:proofErr w:type="gramStart"/>
+            <w:r>
+              <w:rPr>
+                <w:lang w:val="en-US"/>
+              </w:rPr>
+              <w:t>tất</w:t>
+            </w:r>
+            <w:proofErr w:type="spellEnd"/>
+            <w:r>
+              <w:rPr>
+                <w:lang w:val="en-US"/>
+              </w:rPr>
+              <w:t>(</w:t>
+            </w:r>
+            <w:proofErr w:type="gramEnd"/>
+            <w:r>
+              <w:rPr>
+                <w:lang w:val="en-US"/>
+              </w:rPr>
+              <w:t>)</w:t>
+            </w:r>
+          </w:p>
+        </w:tc>
+      </w:tr>
+      <w:tr>
+        <w:tc>
+          <w:tcPr>
+            <w:cnfStyle w:val="001000000000" w:firstRow="0" w:lastRow="0" w:firstColumn="1" w:lastColumn="0" w:oddVBand="0" w:evenVBand="0" w:oddHBand="0" w:evenHBand="0" w:firstRowFirstColumn="0" w:firstRowLastColumn="0" w:lastRowFirstColumn="0" w:lastRowLastColumn="0"/>
+            <w:tcW w:w="1823" w:type="dxa"/>
+            <w:hideMark/>
+          </w:tcPr>
+          <w:p>
+            <w:pPr>
+              <w:spacing w:after="120" w:line="300" w:lineRule="auto"/>
+              <w:ind w:firstLine="425"/>
+              <w:jc w:val="both"/>
+              <w:rPr>
+                <w:lang w:val="en-US"/>
+              </w:rPr>
+            </w:pPr>
+            <w:proofErr w:type="spellStart"/>
+            <w:r>
+              <w:rPr>
+                <w:lang w:val="en-US"/>
+              </w:rPr>
+              <w:t>Xét</w:t>
+            </w:r>
+            <w:proofErr w:type="spellEnd"/>
+            <w:r>
+              <w:rPr>
+                <w:lang w:val="en-US"/>
+              </w:rPr>
+              <w:t xml:space="preserve"> </w:t>
+            </w:r>
+            <w:proofErr w:type="spellStart"/>
+            <w:r>
+              <w:rPr>
+                <w:lang w:val="en-US"/>
+              </w:rPr>
+              <w:t>nghiệm</w:t>
+            </w:r>
+            <w:proofErr w:type="spellEnd"/>
+          </w:p>
+        </w:tc>
+        <w:tc>
+          <w:tcPr>
+            <w:tcW w:w="1387" w:type="dxa"/>
+            <w:hideMark/>
+          </w:tcPr>
+          <w:p>
+            <w:pPr>
+              <w:spacing w:after="120" w:line="300" w:lineRule="auto"/>
+              <w:ind w:firstLine="425"/>
+              <w:jc w:val="both"/>
+              <w:cnfStyle w:val="000000000000" w:firstRow="0" w:lastRow="0" w:firstColumn="0" w:lastColumn="0" w:oddVBand="0" w:evenVBand="0" w:oddHBand="0" w:evenHBand="0" w:firstRowFirstColumn="0" w:firstRowLastColumn="0" w:lastRowFirstColumn="0" w:lastRowLastColumn="0"/>
+              <w:rPr>
+                <w:lang w:val="en-US"/>
+              </w:rPr>
+            </w:pPr>
+            <w:proofErr w:type="spellStart"/>
+            <w:r>
+              <w:rPr>
+                <w:lang w:val="en-US"/>
+              </w:rPr>
+              <w:t>Mã</w:t>
+            </w:r>
+            <w:proofErr w:type="spellEnd"/>
+            <w:r>
+              <w:rPr>
+                <w:lang w:val="en-US"/>
+              </w:rPr>
+              <w:t xml:space="preserve"> </w:t>
+            </w:r>
+            <w:proofErr w:type="spellStart"/>
+            <w:r>
+              <w:rPr>
+                <w:lang w:val="en-US"/>
+              </w:rPr>
+              <w:t>xét</w:t>
+            </w:r>
+            <w:proofErr w:type="spellEnd"/>
+            <w:r>
+              <w:rPr>
+                <w:lang w:val="en-US"/>
+              </w:rPr>
+              <w:t xml:space="preserve"> </w:t>
+            </w:r>
+            <w:proofErr w:type="spellStart"/>
+            <w:r>
+              <w:rPr>
+                <w:lang w:val="en-US"/>
+              </w:rPr>
+              <w:t>nghiệm</w:t>
+            </w:r>
+            <w:proofErr w:type="spellEnd"/>
+          </w:p>
+        </w:tc>
+        <w:tc>
+          <w:tcPr>
+            <w:tcW w:w="3579" w:type="dxa"/>
+            <w:hideMark/>
+          </w:tcPr>
+          <w:p>
+            <w:pPr>
+              <w:spacing w:after="120" w:line="300" w:lineRule="auto"/>
+              <w:ind w:firstLine="425"/>
+              <w:jc w:val="both"/>
+              <w:cnfStyle w:val="000000000000" w:firstRow="0" w:lastRow="0" w:firstColumn="0" w:lastColumn="0" w:oddVBand="0" w:evenVBand="0" w:oddHBand="0" w:evenHBand="0" w:firstRowFirstColumn="0" w:firstRowLastColumn="0" w:lastRowFirstColumn="0" w:lastRowLastColumn="0"/>
+              <w:rPr>
+                <w:lang w:val="en-US"/>
+              </w:rPr>
+            </w:pPr>
+            <w:proofErr w:type="spellStart"/>
+            <w:r>
+              <w:rPr>
+                <w:lang w:val="en-US"/>
+              </w:rPr>
+              <w:t>Mã</w:t>
+            </w:r>
+            <w:proofErr w:type="spellEnd"/>
+            <w:r>
+              <w:rPr>
+                <w:lang w:val="en-US"/>
+              </w:rPr>
+              <w:t xml:space="preserve"> </w:t>
+            </w:r>
+            <w:proofErr w:type="spellStart"/>
+            <w:r>
+              <w:rPr>
+                <w:lang w:val="en-US"/>
+              </w:rPr>
+              <w:t>phiếu</w:t>
+            </w:r>
+            <w:proofErr w:type="spellEnd"/>
+            <w:r>
+              <w:rPr>
+                <w:lang w:val="en-US"/>
+              </w:rPr>
+              <w:t xml:space="preserve"> </w:t>
+            </w:r>
+            <w:proofErr w:type="spellStart"/>
+            <w:r>
+              <w:rPr>
+                <w:lang w:val="en-US"/>
+              </w:rPr>
+              <w:t>khám</w:t>
+            </w:r>
+            <w:proofErr w:type="spellEnd"/>
+            <w:r>
+              <w:rPr>
+                <w:lang w:val="en-US"/>
+              </w:rPr>
+              <w:t xml:space="preserve">, </w:t>
+            </w:r>
+            <w:proofErr w:type="spellStart"/>
+            <w:r>
+              <w:rPr>
+                <w:lang w:val="en-US"/>
+              </w:rPr>
+              <w:t>tên</w:t>
+            </w:r>
+            <w:proofErr w:type="spellEnd"/>
+            <w:r>
+              <w:rPr>
+                <w:lang w:val="en-US"/>
+              </w:rPr>
+              <w:t xml:space="preserve"> </w:t>
+            </w:r>
+            <w:proofErr w:type="spellStart"/>
+            <w:r>
+              <w:rPr>
+                <w:lang w:val="en-US"/>
+              </w:rPr>
+              <w:t>xét</w:t>
+            </w:r>
+            <w:proofErr w:type="spellEnd"/>
+            <w:r>
+              <w:rPr>
+                <w:lang w:val="en-US"/>
+              </w:rPr>
+              <w:t xml:space="preserve"> </w:t>
+            </w:r>
+            <w:proofErr w:type="spellStart"/>
+            <w:r>
+              <w:rPr>
+                <w:lang w:val="en-US"/>
+              </w:rPr>
+              <w:t>nghiệm</w:t>
+            </w:r>
+            <w:proofErr w:type="spellEnd"/>
+            <w:r>
+              <w:rPr>
+                <w:lang w:val="en-US"/>
+              </w:rPr>
+              <w:t xml:space="preserve">, </w:t>
+            </w:r>
+            <w:proofErr w:type="spellStart"/>
+            <w:r>
+              <w:rPr>
+                <w:lang w:val="en-US"/>
+              </w:rPr>
+              <w:t>kết</w:t>
+            </w:r>
+            <w:proofErr w:type="spellEnd"/>
+            <w:r>
+              <w:rPr>
+                <w:lang w:val="en-US"/>
+              </w:rPr>
+              <w:t xml:space="preserve"> </w:t>
+            </w:r>
+            <w:proofErr w:type="spellStart"/>
+            <w:r>
+              <w:rPr>
+                <w:lang w:val="en-US"/>
+              </w:rPr>
+              <w:t>quả</w:t>
+            </w:r>
+            <w:proofErr w:type="spellEnd"/>
+            <w:r>
+              <w:rPr>
+                <w:lang w:val="en-US"/>
+              </w:rPr>
+              <w:t xml:space="preserve">, </w:t>
+            </w:r>
+            <w:proofErr w:type="spellStart"/>
+            <w:r>
+              <w:rPr>
+                <w:lang w:val="en-US"/>
+              </w:rPr>
+              <w:t>ngày</w:t>
+            </w:r>
+            <w:proofErr w:type="spellEnd"/>
+            <w:r>
+              <w:rPr>
+                <w:lang w:val="en-US"/>
+              </w:rPr>
+              <w:t xml:space="preserve"> </w:t>
+            </w:r>
+            <w:proofErr w:type="spellStart"/>
+            <w:r>
+              <w:rPr>
+                <w:lang w:val="en-US"/>
+              </w:rPr>
+              <w:t>trả</w:t>
+            </w:r>
+            <w:proofErr w:type="spellEnd"/>
+            <w:r>
+              <w:rPr>
+                <w:lang w:val="en-US"/>
+              </w:rPr>
+              <w:t xml:space="preserve"> </w:t>
+            </w:r>
+            <w:proofErr w:type="spellStart"/>
+            <w:r>
+              <w:rPr>
+                <w:lang w:val="en-US"/>
+              </w:rPr>
+              <w:t>kết</w:t>
+            </w:r>
+            <w:proofErr w:type="spellEnd"/>
+            <w:r>
+              <w:rPr>
+                <w:lang w:val="en-US"/>
+              </w:rPr>
+              <w:t xml:space="preserve"> </w:t>
+            </w:r>
+            <w:proofErr w:type="spellStart"/>
+            <w:r>
+              <w:rPr>
+                <w:lang w:val="en-US"/>
+              </w:rPr>
+              <w:t>quả</w:t>
+            </w:r>
+            <w:proofErr w:type="spellEnd"/>
+            <w:r>
+              <w:rPr>
+                <w:lang w:val="en-US"/>
+              </w:rPr>
+              <w:t xml:space="preserve">, </w:t>
+            </w:r>
+            <w:proofErr w:type="spellStart"/>
+            <w:r>
+              <w:rPr>
+                <w:lang w:val="en-US"/>
+              </w:rPr>
+              <w:t>trạng</w:t>
+            </w:r>
+            <w:proofErr w:type="spellEnd"/>
+            <w:r>
+              <w:rPr>
+                <w:lang w:val="en-US"/>
+              </w:rPr>
+              <w:t xml:space="preserve"> </w:t>
+            </w:r>
+            <w:proofErr w:type="spellStart"/>
+            <w:r>
+              <w:rPr>
+                <w:lang w:val="en-US"/>
+              </w:rPr>
+              <w:t>thái</w:t>
+            </w:r>
+            <w:proofErr w:type="spellEnd"/>
+          </w:p>
+        </w:tc>
+        <w:tc>
+          <w:tcPr>
+            <w:tcW w:w="2890" w:type="dxa"/>
+            <w:hideMark/>
+          </w:tcPr>
+          <w:p>
+            <w:pPr>
+              <w:spacing w:after="120" w:line="300" w:lineRule="auto"/>
+              <w:ind w:firstLine="425"/>
+              <w:jc w:val="both"/>
+              <w:cnfStyle w:val="000000000000" w:firstRow="0" w:lastRow="0" w:firstColumn="0" w:lastColumn="0" w:oddVBand="0" w:evenVBand="0" w:oddHBand="0" w:evenHBand="0" w:firstRowFirstColumn="0" w:firstRowLastColumn="0" w:lastRowFirstColumn="0" w:lastRowLastColumn="0"/>
+              <w:rPr>
+                <w:lang w:val="en-US"/>
+              </w:rPr>
+            </w:pPr>
+            <w:proofErr w:type="spellStart"/>
+            <w:r>
+              <w:rPr>
+                <w:lang w:val="en-US"/>
+              </w:rPr>
+              <w:t>Tạo</w:t>
+            </w:r>
+            <w:proofErr w:type="spellEnd"/>
+            <w:r>
+              <w:rPr>
+                <w:lang w:val="en-US"/>
+              </w:rPr>
+              <w:t xml:space="preserve"> </w:t>
+            </w:r>
+            <w:proofErr w:type="spellStart"/>
+            <w:r>
+              <w:rPr>
+                <w:lang w:val="en-US"/>
+              </w:rPr>
+              <w:t>chỉ</w:t>
+            </w:r>
+            <w:proofErr w:type="spellEnd"/>
+            <w:r>
+              <w:rPr>
+                <w:lang w:val="en-US"/>
+              </w:rPr>
+              <w:t xml:space="preserve"> </w:t>
+            </w:r>
+            <w:proofErr w:type="spellStart"/>
+            <w:proofErr w:type="gramStart"/>
+            <w:r>
+              <w:rPr>
+                <w:lang w:val="en-US"/>
+              </w:rPr>
+              <w:t>định</w:t>
+            </w:r>
+            <w:proofErr w:type="spellEnd"/>
+            <w:r>
+              <w:rPr>
+                <w:lang w:val="en-US"/>
+              </w:rPr>
+              <w:t>(</w:t>
+            </w:r>
+            <w:proofErr w:type="gramEnd"/>
+            <w:r>
+              <w:rPr>
+                <w:lang w:val="en-US"/>
+              </w:rPr>
+              <w:t xml:space="preserve">), Nhập </w:t>
+            </w:r>
+            <w:proofErr w:type="spellStart"/>
+            <w:r>
+              <w:rPr>
+                <w:lang w:val="en-US"/>
+              </w:rPr>
+              <w:t>kết</w:t>
+            </w:r>
+            <w:proofErr w:type="spellEnd"/>
+            <w:r>
+              <w:rPr>
+                <w:lang w:val="en-US"/>
+              </w:rPr>
+              <w:t xml:space="preserve"> </w:t>
+            </w:r>
+            <w:proofErr w:type="spellStart"/>
+            <w:proofErr w:type="gramStart"/>
+            <w:r>
+              <w:rPr>
+                <w:lang w:val="en-US"/>
+              </w:rPr>
+              <w:t>quả</w:t>
+            </w:r>
+            <w:proofErr w:type="spellEnd"/>
+            <w:r>
+              <w:rPr>
+                <w:lang w:val="en-US"/>
+              </w:rPr>
+              <w:t>(</w:t>
+            </w:r>
+            <w:proofErr w:type="gramEnd"/>
+            <w:r>
+              <w:rPr>
+                <w:lang w:val="en-US"/>
+              </w:rPr>
+              <w:t>)</w:t>
+            </w:r>
+          </w:p>
+        </w:tc>
+      </w:tr>
+      <w:tr>
+        <w:trPr>
+          <w:cnfStyle w:val="000000100000" w:firstRow="0" w:lastRow="0" w:firstColumn="0" w:lastColumn="0" w:oddVBand="0" w:evenVBand="0" w:oddHBand="1" w:evenHBand="0" w:firstRowFirstColumn="0" w:firstRowLastColumn="0" w:lastRowFirstColumn="0" w:lastRowLastColumn="0"/>
+        </w:trPr>
+        <w:tc>
+          <w:tcPr>
+            <w:cnfStyle w:val="001000000000" w:firstRow="0" w:lastRow="0" w:firstColumn="1" w:lastColumn="0" w:oddVBand="0" w:evenVBand="0" w:oddHBand="0" w:evenHBand="0" w:firstRowFirstColumn="0" w:firstRowLastColumn="0" w:lastRowFirstColumn="0" w:lastRowLastColumn="0"/>
+            <w:tcW w:w="1823" w:type="dxa"/>
+            <w:hideMark/>
+          </w:tcPr>
+          <w:p>
+            <w:pPr>
+              <w:spacing w:after="120" w:line="300" w:lineRule="auto"/>
+              <w:ind w:firstLine="425"/>
+              <w:jc w:val="both"/>
+              <w:rPr>
+                <w:lang w:val="en-US"/>
+              </w:rPr>
+            </w:pPr>
+            <w:r>
+              <w:rPr>
+                <w:lang w:val="en-US"/>
+              </w:rPr>
+              <w:t xml:space="preserve">Toa </w:t>
+            </w:r>
+            <w:proofErr w:type="spellStart"/>
+            <w:r>
+              <w:rPr>
+                <w:lang w:val="en-US"/>
+              </w:rPr>
+              <w:t>thuốc</w:t>
+            </w:r>
+            <w:proofErr w:type="spellEnd"/>
+          </w:p>
+        </w:tc>
+        <w:tc>
+          <w:tcPr>
+            <w:tcW w:w="1387" w:type="dxa"/>
+            <w:hideMark/>
+          </w:tcPr>
+          <w:p>
+            <w:pPr>
+              <w:spacing w:after="120" w:line="300" w:lineRule="auto"/>
+              <w:ind w:firstLine="425"/>
+              <w:jc w:val="both"/>
+              <w:cnfStyle w:val="000000100000" w:firstRow="0" w:lastRow="0" w:firstColumn="0" w:lastColumn="0" w:oddVBand="0" w:evenVBand="0" w:oddHBand="1" w:evenHBand="0" w:firstRowFirstColumn="0" w:firstRowLastColumn="0" w:lastRowFirstColumn="0" w:lastRowLastColumn="0"/>
+              <w:rPr>
+                <w:lang w:val="en-US"/>
+              </w:rPr>
+            </w:pPr>
+            <w:proofErr w:type="spellStart"/>
+            <w:r>
+              <w:rPr>
+                <w:lang w:val="en-US"/>
+              </w:rPr>
+              <w:t>Mã</w:t>
+            </w:r>
+            <w:proofErr w:type="spellEnd"/>
+            <w:r>
+              <w:rPr>
+                <w:lang w:val="en-US"/>
+              </w:rPr>
+              <w:t xml:space="preserve"> toa</w:t>
+            </w:r>
+          </w:p>
+        </w:tc>
+        <w:tc>
+          <w:tcPr>
+            <w:tcW w:w="3579" w:type="dxa"/>
+            <w:hideMark/>
+          </w:tcPr>
+          <w:p>
+            <w:pPr>
+              <w:spacing w:after="120" w:line="300" w:lineRule="auto"/>
+              <w:ind w:firstLine="425"/>
+              <w:jc w:val="both"/>
+              <w:cnfStyle w:val="000000100000" w:firstRow="0" w:lastRow="0" w:firstColumn="0" w:lastColumn="0" w:oddVBand="0" w:evenVBand="0" w:oddHBand="1" w:evenHBand="0" w:firstRowFirstColumn="0" w:firstRowLastColumn="0" w:lastRowFirstColumn="0" w:lastRowLastColumn="0"/>
+              <w:rPr>
+                <w:lang w:val="en-US"/>
+              </w:rPr>
+            </w:pPr>
+            <w:proofErr w:type="spellStart"/>
+            <w:r>
+              <w:rPr>
+                <w:lang w:val="en-US"/>
+              </w:rPr>
+              <w:t>Mã</w:t>
+            </w:r>
+            <w:proofErr w:type="spellEnd"/>
+            <w:r>
+              <w:rPr>
+                <w:lang w:val="en-US"/>
+              </w:rPr>
+              <w:t xml:space="preserve"> </w:t>
+            </w:r>
+            <w:proofErr w:type="spellStart"/>
+            <w:r>
+              <w:rPr>
+                <w:lang w:val="en-US"/>
+              </w:rPr>
+              <w:t>phiếu</w:t>
+            </w:r>
+            <w:proofErr w:type="spellEnd"/>
+            <w:r>
+              <w:rPr>
+                <w:lang w:val="en-US"/>
+              </w:rPr>
+              <w:t xml:space="preserve"> </w:t>
+            </w:r>
+            <w:proofErr w:type="spellStart"/>
+            <w:r>
+              <w:rPr>
+                <w:lang w:val="en-US"/>
+              </w:rPr>
+              <w:t>khám</w:t>
+            </w:r>
+            <w:proofErr w:type="spellEnd"/>
+            <w:r>
+              <w:rPr>
+                <w:lang w:val="en-US"/>
+              </w:rPr>
+              <w:t xml:space="preserve">, </w:t>
+            </w:r>
+            <w:proofErr w:type="spellStart"/>
+            <w:r>
+              <w:rPr>
+                <w:lang w:val="en-US"/>
+              </w:rPr>
+              <w:t>ngày</w:t>
+            </w:r>
+            <w:proofErr w:type="spellEnd"/>
+            <w:r>
+              <w:rPr>
+                <w:lang w:val="en-US"/>
+              </w:rPr>
+              <w:t xml:space="preserve"> </w:t>
+            </w:r>
+            <w:proofErr w:type="spellStart"/>
+            <w:r>
+              <w:rPr>
+                <w:lang w:val="en-US"/>
+              </w:rPr>
+              <w:t>lập</w:t>
+            </w:r>
+            <w:proofErr w:type="spellEnd"/>
+            <w:r>
+              <w:rPr>
+                <w:lang w:val="en-US"/>
+              </w:rPr>
+              <w:t xml:space="preserve">, </w:t>
+            </w:r>
+            <w:proofErr w:type="spellStart"/>
+            <w:r>
+              <w:rPr>
+                <w:lang w:val="en-US"/>
+              </w:rPr>
+              <w:t>danh</w:t>
+            </w:r>
+            <w:proofErr w:type="spellEnd"/>
+            <w:r>
+              <w:rPr>
+                <w:lang w:val="en-US"/>
+              </w:rPr>
+              <w:t xml:space="preserve"> </w:t>
+            </w:r>
+            <w:proofErr w:type="spellStart"/>
+            <w:r>
+              <w:rPr>
+                <w:lang w:val="en-US"/>
+              </w:rPr>
+              <w:t>sách</w:t>
+            </w:r>
+            <w:proofErr w:type="spellEnd"/>
+            <w:r>
+              <w:rPr>
+                <w:lang w:val="en-US"/>
+              </w:rPr>
+              <w:t xml:space="preserve"> </w:t>
+            </w:r>
+            <w:proofErr w:type="spellStart"/>
+            <w:r>
+              <w:rPr>
+                <w:lang w:val="en-US"/>
+              </w:rPr>
+              <w:t>thuốc</w:t>
+            </w:r>
+            <w:proofErr w:type="spellEnd"/>
+            <w:r>
+              <w:rPr>
+                <w:lang w:val="en-US"/>
+              </w:rPr>
+              <w:t xml:space="preserve">, </w:t>
+            </w:r>
+            <w:proofErr w:type="spellStart"/>
+            <w:r>
+              <w:rPr>
+                <w:lang w:val="en-US"/>
+              </w:rPr>
+              <w:t>liều</w:t>
+            </w:r>
+            <w:proofErr w:type="spellEnd"/>
+            <w:r>
+              <w:rPr>
+                <w:lang w:val="en-US"/>
+              </w:rPr>
+              <w:t xml:space="preserve"> </w:t>
+            </w:r>
+            <w:proofErr w:type="spellStart"/>
+            <w:r>
+              <w:rPr>
+                <w:lang w:val="en-US"/>
+              </w:rPr>
+              <w:t>dùng</w:t>
+            </w:r>
+            <w:proofErr w:type="spellEnd"/>
+            <w:r>
+              <w:rPr>
+                <w:lang w:val="en-US"/>
+              </w:rPr>
+              <w:t xml:space="preserve">, </w:t>
+            </w:r>
+            <w:proofErr w:type="spellStart"/>
+            <w:r>
+              <w:rPr>
+                <w:lang w:val="en-US"/>
+              </w:rPr>
+              <w:t>cách</w:t>
+            </w:r>
+            <w:proofErr w:type="spellEnd"/>
+            <w:r>
+              <w:rPr>
+                <w:lang w:val="en-US"/>
+              </w:rPr>
+              <w:t xml:space="preserve"> </w:t>
+            </w:r>
+            <w:proofErr w:type="spellStart"/>
+            <w:r>
+              <w:rPr>
+                <w:lang w:val="en-US"/>
+              </w:rPr>
+              <w:t>dùng</w:t>
+            </w:r>
+            <w:proofErr w:type="spellEnd"/>
+            <w:r>
+              <w:rPr>
+                <w:lang w:val="en-US"/>
+              </w:rPr>
+              <w:t xml:space="preserve">, </w:t>
+            </w:r>
+            <w:proofErr w:type="spellStart"/>
+            <w:r>
+              <w:rPr>
+                <w:lang w:val="en-US"/>
+              </w:rPr>
+              <w:t>lời</w:t>
+            </w:r>
+            <w:proofErr w:type="spellEnd"/>
+            <w:r>
+              <w:rPr>
+                <w:lang w:val="en-US"/>
+              </w:rPr>
+              <w:t xml:space="preserve"> </w:t>
+            </w:r>
+            <w:proofErr w:type="spellStart"/>
+            <w:r>
+              <w:rPr>
+                <w:lang w:val="en-US"/>
+              </w:rPr>
+              <w:t>dặn</w:t>
+            </w:r>
+            <w:proofErr w:type="spellEnd"/>
+          </w:p>
+        </w:tc>
+        <w:tc>
+          <w:tcPr>
+            <w:tcW w:w="2890" w:type="dxa"/>
+            <w:hideMark/>
+          </w:tcPr>
+          <w:p>
+            <w:pPr>
+              <w:spacing w:after="120" w:line="300" w:lineRule="auto"/>
+              <w:ind w:firstLine="425"/>
+              <w:jc w:val="both"/>
+              <w:cnfStyle w:val="000000100000" w:firstRow="0" w:lastRow="0" w:firstColumn="0" w:lastColumn="0" w:oddVBand="0" w:evenVBand="0" w:oddHBand="1" w:evenHBand="0" w:firstRowFirstColumn="0" w:firstRowLastColumn="0" w:lastRowFirstColumn="0" w:lastRowLastColumn="0"/>
+              <w:rPr>
+                <w:lang w:val="en-US"/>
+              </w:rPr>
+            </w:pPr>
+            <w:proofErr w:type="spellStart"/>
+            <w:r>
+              <w:rPr>
+                <w:lang w:val="en-US"/>
+              </w:rPr>
+              <w:t>Lập</w:t>
+            </w:r>
+            <w:proofErr w:type="spellEnd"/>
+            <w:r>
+              <w:rPr>
+                <w:lang w:val="en-US"/>
+              </w:rPr>
+              <w:t xml:space="preserve"> </w:t>
+            </w:r>
+            <w:proofErr w:type="gramStart"/>
+            <w:r>
+              <w:rPr>
+                <w:lang w:val="en-US"/>
+              </w:rPr>
+              <w:t>toa(</w:t>
+            </w:r>
+            <w:proofErr w:type="gramEnd"/>
+            <w:r>
+              <w:rPr>
+                <w:lang w:val="en-US"/>
+              </w:rPr>
+              <w:t xml:space="preserve">), </w:t>
+            </w:r>
+            <w:proofErr w:type="spellStart"/>
+            <w:r>
+              <w:rPr>
+                <w:lang w:val="en-US"/>
+              </w:rPr>
+              <w:t>Thêm</w:t>
+            </w:r>
+            <w:proofErr w:type="spellEnd"/>
+            <w:r>
+              <w:rPr>
+                <w:lang w:val="en-US"/>
+              </w:rPr>
+              <w:t xml:space="preserve"> </w:t>
+            </w:r>
+            <w:proofErr w:type="spellStart"/>
+            <w:proofErr w:type="gramStart"/>
+            <w:r>
+              <w:rPr>
+                <w:lang w:val="en-US"/>
+              </w:rPr>
+              <w:t>thuốc</w:t>
+            </w:r>
+            <w:proofErr w:type="spellEnd"/>
+            <w:r>
+              <w:rPr>
+                <w:lang w:val="en-US"/>
+              </w:rPr>
+              <w:t>(</w:t>
+            </w:r>
+            <w:proofErr w:type="gramEnd"/>
+            <w:r>
+              <w:rPr>
+                <w:lang w:val="en-US"/>
+              </w:rPr>
+              <w:t xml:space="preserve">), </w:t>
+            </w:r>
+            <w:proofErr w:type="spellStart"/>
+            <w:r>
+              <w:rPr>
+                <w:lang w:val="en-US"/>
+              </w:rPr>
+              <w:t>Xóa</w:t>
+            </w:r>
+            <w:proofErr w:type="spellEnd"/>
+            <w:r>
+              <w:rPr>
+                <w:lang w:val="en-US"/>
+              </w:rPr>
+              <w:t xml:space="preserve"> </w:t>
+            </w:r>
+            <w:proofErr w:type="spellStart"/>
+            <w:proofErr w:type="gramStart"/>
+            <w:r>
+              <w:rPr>
+                <w:lang w:val="en-US"/>
+              </w:rPr>
+              <w:t>thuốc</w:t>
+            </w:r>
+            <w:proofErr w:type="spellEnd"/>
+            <w:r>
+              <w:rPr>
+                <w:lang w:val="en-US"/>
+              </w:rPr>
+              <w:t>(</w:t>
+            </w:r>
+            <w:proofErr w:type="gramEnd"/>
+            <w:r>
+              <w:rPr>
+                <w:lang w:val="en-US"/>
+              </w:rPr>
+              <w:t>)</w:t>
+            </w:r>
+          </w:p>
+        </w:tc>
+      </w:tr>
+      <w:tr>
+        <w:tc>
+          <w:tcPr>
+            <w:cnfStyle w:val="001000000000" w:firstRow="0" w:lastRow="0" w:firstColumn="1" w:lastColumn="0" w:oddVBand="0" w:evenVBand="0" w:oddHBand="0" w:evenHBand="0" w:firstRowFirstColumn="0" w:firstRowLastColumn="0" w:lastRowFirstColumn="0" w:lastRowLastColumn="0"/>
+            <w:tcW w:w="1823" w:type="dxa"/>
+            <w:hideMark/>
+          </w:tcPr>
+          <w:p>
+            <w:pPr>
+              <w:spacing w:after="120" w:line="300" w:lineRule="auto"/>
+              <w:ind w:firstLine="425"/>
+              <w:jc w:val="both"/>
+              <w:rPr>
+                <w:lang w:val="en-US"/>
+              </w:rPr>
+            </w:pPr>
+            <w:r>
+              <w:rPr>
+                <w:lang w:val="en-US"/>
+              </w:rPr>
+              <w:t xml:space="preserve">Thanh </w:t>
+            </w:r>
+            <w:proofErr w:type="spellStart"/>
+            <w:r>
+              <w:rPr>
+                <w:lang w:val="en-US"/>
+              </w:rPr>
+              <w:t>toán</w:t>
+            </w:r>
+            <w:proofErr w:type="spellEnd"/>
+            <w:r>
+              <w:rPr>
+                <w:lang w:val="en-US"/>
+              </w:rPr>
+              <w:t xml:space="preserve"> </w:t>
+            </w:r>
+            <w:proofErr w:type="spellStart"/>
+            <w:r>
+              <w:rPr>
+                <w:lang w:val="en-US"/>
+              </w:rPr>
+              <w:t>viện</w:t>
+            </w:r>
+            <w:proofErr w:type="spellEnd"/>
+            <w:r>
+              <w:rPr>
+                <w:lang w:val="en-US"/>
+              </w:rPr>
+              <w:t xml:space="preserve"> </w:t>
+            </w:r>
+            <w:proofErr w:type="spellStart"/>
+            <w:r>
+              <w:rPr>
+                <w:lang w:val="en-US"/>
+              </w:rPr>
+              <w:t>phí</w:t>
+            </w:r>
+            <w:proofErr w:type="spellEnd"/>
+          </w:p>
+        </w:tc>
+        <w:tc>
+          <w:tcPr>
+            <w:tcW w:w="1387" w:type="dxa"/>
+            <w:hideMark/>
+          </w:tcPr>
+          <w:p>
+            <w:pPr>
+              <w:spacing w:after="120" w:line="300" w:lineRule="auto"/>
+              <w:ind w:firstLine="425"/>
+              <w:jc w:val="both"/>
+              <w:cnfStyle w:val="000000000000" w:firstRow="0" w:lastRow="0" w:firstColumn="0" w:lastColumn="0" w:oddVBand="0" w:evenVBand="0" w:oddHBand="0" w:evenHBand="0" w:firstRowFirstColumn="0" w:firstRowLastColumn="0" w:lastRowFirstColumn="0" w:lastRowLastColumn="0"/>
+              <w:rPr>
+                <w:lang w:val="en-US"/>
+              </w:rPr>
+            </w:pPr>
+            <w:proofErr w:type="spellStart"/>
+            <w:r>
+              <w:rPr>
+                <w:lang w:val="en-US"/>
+              </w:rPr>
+              <w:t>Mã</w:t>
+            </w:r>
+            <w:proofErr w:type="spellEnd"/>
+            <w:r>
+              <w:rPr>
+                <w:lang w:val="en-US"/>
+              </w:rPr>
+              <w:t xml:space="preserve"> </w:t>
+            </w:r>
+            <w:proofErr w:type="spellStart"/>
+            <w:r>
+              <w:rPr>
+                <w:lang w:val="en-US"/>
+              </w:rPr>
+              <w:t>thanh</w:t>
+            </w:r>
+            <w:proofErr w:type="spellEnd"/>
+            <w:r>
+              <w:rPr>
+                <w:lang w:val="en-US"/>
+              </w:rPr>
+              <w:t xml:space="preserve"> </w:t>
+            </w:r>
+            <w:proofErr w:type="spellStart"/>
+            <w:r>
+              <w:rPr>
+                <w:lang w:val="en-US"/>
+              </w:rPr>
+              <w:t>toán</w:t>
+            </w:r>
+            <w:proofErr w:type="spellEnd"/>
+          </w:p>
+        </w:tc>
+        <w:tc>
+          <w:tcPr>
+            <w:tcW w:w="3579" w:type="dxa"/>
+            <w:hideMark/>
+          </w:tcPr>
+          <w:p>
+            <w:pPr>
+              <w:spacing w:after="120" w:line="300" w:lineRule="auto"/>
+              <w:ind w:firstLine="425"/>
+              <w:jc w:val="both"/>
+              <w:cnfStyle w:val="000000000000" w:firstRow="0" w:lastRow="0" w:firstColumn="0" w:lastColumn="0" w:oddVBand="0" w:evenVBand="0" w:oddHBand="0" w:evenHBand="0" w:firstRowFirstColumn="0" w:firstRowLastColumn="0" w:lastRowFirstColumn="0" w:lastRowLastColumn="0"/>
+              <w:rPr>
+                <w:lang w:val="en-US"/>
+              </w:rPr>
+            </w:pPr>
+            <w:proofErr w:type="spellStart"/>
+            <w:r>
+              <w:rPr>
+                <w:lang w:val="en-US"/>
+              </w:rPr>
+              <w:t>Mã</w:t>
+            </w:r>
+            <w:proofErr w:type="spellEnd"/>
+            <w:r>
+              <w:rPr>
+                <w:lang w:val="en-US"/>
+              </w:rPr>
+              <w:t xml:space="preserve"> </w:t>
+            </w:r>
+            <w:proofErr w:type="spellStart"/>
+            <w:r>
+              <w:rPr>
+                <w:lang w:val="en-US"/>
+              </w:rPr>
+              <w:t>phiếu</w:t>
+            </w:r>
+            <w:proofErr w:type="spellEnd"/>
+            <w:r>
+              <w:rPr>
+                <w:lang w:val="en-US"/>
+              </w:rPr>
+              <w:t xml:space="preserve"> </w:t>
+            </w:r>
+            <w:proofErr w:type="spellStart"/>
+            <w:r>
+              <w:rPr>
+                <w:lang w:val="en-US"/>
+              </w:rPr>
+              <w:t>khám</w:t>
+            </w:r>
+            <w:proofErr w:type="spellEnd"/>
+            <w:r>
+              <w:rPr>
+                <w:lang w:val="en-US"/>
+              </w:rPr>
+              <w:t xml:space="preserve">, </w:t>
+            </w:r>
+            <w:proofErr w:type="spellStart"/>
+            <w:r>
+              <w:rPr>
+                <w:lang w:val="en-US"/>
+              </w:rPr>
+              <w:t>số</w:t>
+            </w:r>
+            <w:proofErr w:type="spellEnd"/>
+            <w:r>
+              <w:rPr>
+                <w:lang w:val="en-US"/>
+              </w:rPr>
+              <w:t xml:space="preserve"> </w:t>
+            </w:r>
+            <w:proofErr w:type="spellStart"/>
+            <w:r>
+              <w:rPr>
+                <w:lang w:val="en-US"/>
+              </w:rPr>
+              <w:t>tiền</w:t>
+            </w:r>
+            <w:proofErr w:type="spellEnd"/>
+            <w:r>
+              <w:rPr>
+                <w:lang w:val="en-US"/>
+              </w:rPr>
+              <w:t xml:space="preserve">, </w:t>
+            </w:r>
+            <w:proofErr w:type="spellStart"/>
+            <w:r>
+              <w:rPr>
+                <w:lang w:val="en-US"/>
+              </w:rPr>
+              <w:t>ngày</w:t>
+            </w:r>
+            <w:proofErr w:type="spellEnd"/>
+            <w:r>
+              <w:rPr>
+                <w:lang w:val="en-US"/>
+              </w:rPr>
+              <w:t xml:space="preserve"> </w:t>
+            </w:r>
+            <w:proofErr w:type="spellStart"/>
+            <w:r>
+              <w:rPr>
+                <w:lang w:val="en-US"/>
+              </w:rPr>
+              <w:t>thanh</w:t>
+            </w:r>
+            <w:proofErr w:type="spellEnd"/>
+            <w:r>
+              <w:rPr>
+                <w:lang w:val="en-US"/>
+              </w:rPr>
+              <w:t xml:space="preserve"> </w:t>
+            </w:r>
+            <w:proofErr w:type="spellStart"/>
+            <w:r>
+              <w:rPr>
+                <w:lang w:val="en-US"/>
+              </w:rPr>
+              <w:t>toán</w:t>
+            </w:r>
+            <w:proofErr w:type="spellEnd"/>
+            <w:r>
+              <w:rPr>
+                <w:lang w:val="en-US"/>
+              </w:rPr>
+              <w:t xml:space="preserve">, </w:t>
+            </w:r>
+            <w:proofErr w:type="spellStart"/>
+            <w:r>
+              <w:rPr>
+                <w:lang w:val="en-US"/>
+              </w:rPr>
+              <w:t>phương</w:t>
+            </w:r>
+            <w:proofErr w:type="spellEnd"/>
+            <w:r>
+              <w:rPr>
+                <w:lang w:val="en-US"/>
+              </w:rPr>
+              <w:t xml:space="preserve"> </w:t>
+            </w:r>
+            <w:proofErr w:type="spellStart"/>
+            <w:r>
+              <w:rPr>
+                <w:lang w:val="en-US"/>
+              </w:rPr>
+              <w:t>thức</w:t>
+            </w:r>
+            <w:proofErr w:type="spellEnd"/>
+            <w:r>
+              <w:rPr>
+                <w:lang w:val="en-US"/>
+              </w:rPr>
+              <w:t xml:space="preserve">, </w:t>
+            </w:r>
+            <w:proofErr w:type="spellStart"/>
+            <w:r>
+              <w:rPr>
+                <w:lang w:val="en-US"/>
+              </w:rPr>
+              <w:t>trạng</w:t>
+            </w:r>
+            <w:proofErr w:type="spellEnd"/>
+            <w:r>
+              <w:rPr>
+                <w:lang w:val="en-US"/>
+              </w:rPr>
+              <w:t xml:space="preserve"> </w:t>
+            </w:r>
+            <w:proofErr w:type="spellStart"/>
+            <w:r>
+              <w:rPr>
+                <w:lang w:val="en-US"/>
+              </w:rPr>
+              <w:t>thái</w:t>
+            </w:r>
+            <w:proofErr w:type="spellEnd"/>
+          </w:p>
+        </w:tc>
+        <w:tc>
+          <w:tcPr>
+            <w:tcW w:w="2890" w:type="dxa"/>
+            <w:hideMark/>
+          </w:tcPr>
+          <w:p>
+            <w:pPr>
+              <w:spacing w:after="120" w:line="300" w:lineRule="auto"/>
+              <w:ind w:firstLine="425"/>
+              <w:jc w:val="both"/>
+              <w:cnfStyle w:val="000000000000" w:firstRow="0" w:lastRow="0" w:firstColumn="0" w:lastColumn="0" w:oddVBand="0" w:evenVBand="0" w:oddHBand="0" w:evenHBand="0" w:firstRowFirstColumn="0" w:firstRowLastColumn="0" w:lastRowFirstColumn="0" w:lastRowLastColumn="0"/>
+              <w:rPr>
+                <w:lang w:val="en-US"/>
+              </w:rPr>
+            </w:pPr>
+            <w:r>
+              <w:rPr>
+                <w:lang w:val="en-US"/>
+              </w:rPr>
+              <w:t xml:space="preserve">Thanh </w:t>
+            </w:r>
+            <w:proofErr w:type="spellStart"/>
+            <w:proofErr w:type="gramStart"/>
+            <w:r>
+              <w:rPr>
+                <w:lang w:val="en-US"/>
+              </w:rPr>
+              <w:t>toán</w:t>
+            </w:r>
+            <w:proofErr w:type="spellEnd"/>
+            <w:r>
+              <w:rPr>
+                <w:lang w:val="en-US"/>
+              </w:rPr>
+              <w:t>(</w:t>
+            </w:r>
+            <w:proofErr w:type="gramEnd"/>
+            <w:r>
+              <w:rPr>
+                <w:lang w:val="en-US"/>
+              </w:rPr>
+              <w:t xml:space="preserve">), </w:t>
+            </w:r>
+            <w:proofErr w:type="spellStart"/>
+            <w:r>
+              <w:rPr>
+                <w:lang w:val="en-US"/>
+              </w:rPr>
+              <w:t>Xác</w:t>
+            </w:r>
+            <w:proofErr w:type="spellEnd"/>
+            <w:r>
+              <w:rPr>
+                <w:lang w:val="en-US"/>
+              </w:rPr>
+              <w:t xml:space="preserve"> </w:t>
+            </w:r>
+            <w:proofErr w:type="spellStart"/>
+            <w:r>
+              <w:rPr>
+                <w:lang w:val="en-US"/>
+              </w:rPr>
+              <w:t>nhận</w:t>
+            </w:r>
+            <w:proofErr w:type="spellEnd"/>
+            <w:r>
+              <w:rPr>
+                <w:lang w:val="en-US"/>
+              </w:rPr>
+              <w:t xml:space="preserve"> </w:t>
+            </w:r>
+            <w:proofErr w:type="spellStart"/>
+            <w:r>
+              <w:rPr>
+                <w:lang w:val="en-US"/>
+              </w:rPr>
+              <w:t>thanh</w:t>
+            </w:r>
+            <w:proofErr w:type="spellEnd"/>
+            <w:r>
+              <w:rPr>
+                <w:lang w:val="en-US"/>
+              </w:rPr>
+              <w:t xml:space="preserve"> </w:t>
+            </w:r>
+            <w:proofErr w:type="spellStart"/>
+            <w:proofErr w:type="gramStart"/>
+            <w:r>
+              <w:rPr>
+                <w:lang w:val="en-US"/>
+              </w:rPr>
+              <w:t>toán</w:t>
+            </w:r>
+            <w:proofErr w:type="spellEnd"/>
+            <w:r>
+              <w:rPr>
+                <w:lang w:val="en-US"/>
+              </w:rPr>
+              <w:t>(</w:t>
+            </w:r>
+            <w:proofErr w:type="gramEnd"/>
+            <w:r>
+              <w:rPr>
+                <w:lang w:val="en-US"/>
+              </w:rPr>
+              <w:t>)</w:t>
+            </w:r>
+          </w:p>
+        </w:tc>
+      </w:tr>
+    </w:tbl>
+    <w:p>
+      <w:pPr>
+        <w:spacing w:after="120" w:line="300" w:lineRule="auto"/>
+        <w:ind w:firstLine="425"/>
+        <w:jc w:val="both"/>
+      </w:pPr>
+    </w:p>
+    <w:p>
+      <w:pPr>
+        <w:spacing w:after="120" w:line="300" w:lineRule="auto"/>
+        <w:ind w:firstLine="425"/>
+        <w:jc w:val="both"/>
+        <w:rPr>
+          <w:lang w:val="en-US"/>
+        </w:rPr>
       </w:pPr>
       <w:r>
         <w:rPr>
-          <w:noProof/>
+          <w:lang w:val="en-US"/>
         </w:rPr>
         <w:drawing>
-          <wp:inline distT="0" distB="0" distL="0" distR="0" wp14:anchorId="61702DCA" wp14:editId="721CE5DA">
-            <wp:extent cx="6152515" cy="3845560"/>
-            <wp:effectExtent l="0" t="0" r="635" b="2540"/>
-            <wp:docPr id="29800507" name="Picture 8"/>
+          <wp:inline distT="0" distB="0" distL="0" distR="0" wp14:anchorId="4DF2AA60" wp14:editId="269A61C2">
+            <wp:extent cx="5806440" cy="4579620"/>
+            <wp:effectExtent l="0" t="0" r="0" b="0"/>
+            <wp:docPr id="1940603775" name="Picture 3"/>
             <wp:cNvGraphicFramePr>
               <a:graphicFrameLocks xmlns:a="http://schemas.openxmlformats.org/drawingml/2006/main" noChangeAspect="1"/>
             </wp:cNvGraphicFramePr>
@@ -6270,8 +9709,10 @@
               <a:graphicData uri="http://schemas.openxmlformats.org/drawingml/2006/picture">
                 <pic:pic xmlns:pic="http://schemas.openxmlformats.org/drawingml/2006/picture">
                   <pic:nvPicPr>
-                    <pic:cNvPr id="29800507" name="Picture 29800507"/>
-                    <pic:cNvPicPr/>
+                    <pic:cNvPr id="0" name="Picture 6"/>
+                    <pic:cNvPicPr>
+                      <a:picLocks noChangeAspect="1" noChangeArrowheads="1"/>
+                    </pic:cNvPicPr>
                   </pic:nvPicPr>
                   <pic:blipFill>
                     <a:blip r:embed="rId11" cstate="print">
@@ -6281,18 +9722,23 @@
                         </a:ext>
                       </a:extLst>
                     </a:blip>
+                    <a:srcRect/>
                     <a:stretch>
                       <a:fillRect/>
                     </a:stretch>
                   </pic:blipFill>
-                  <pic:spPr>
+                  <pic:spPr bwMode="auto">
                     <a:xfrm>
                       <a:off x="0" y="0"/>
-                      <a:ext cx="6152515" cy="3845560"/>
+                      <a:ext cx="5806440" cy="4579620"/>
                     </a:xfrm>
                     <a:prstGeom prst="rect">
                       <a:avLst/>
                     </a:prstGeom>
+                    <a:noFill/>
+                    <a:ln>
+                      <a:noFill/>
+                    </a:ln>
                   </pic:spPr>
                 </pic:pic>
               </a:graphicData>
@@ -6300,6 +9746,20 @@
           </wp:inline>
         </w:drawing>
       </w:r>
+    </w:p>
+    <w:p>
+      <w:pPr>
+        <w:spacing w:after="120" w:line="300" w:lineRule="auto"/>
+        <w:ind w:firstLine="425"/>
+        <w:jc w:val="both"/>
+      </w:pPr>
+    </w:p>
+    <w:p>
+      <w:pPr>
+        <w:spacing w:after="120" w:line="300" w:lineRule="auto"/>
+        <w:ind w:firstLine="425"/>
+        <w:jc w:val="both"/>
+      </w:pPr>
     </w:p>
     <w:p>
       <w:pPr>
@@ -6365,6 +9825,9 @@
         <w:jc w:val="both"/>
       </w:pPr>
       <w:r>
+        <w:rPr>
+          <w:noProof/>
+        </w:rPr>
         <w:drawing>
           <wp:inline distT="0" distB="0" distL="0" distR="0" wp14:anchorId="18823F9A" wp14:editId="5DB9B0C3">
             <wp:extent cx="6152515" cy="3855720"/>
@@ -6433,6 +9896,9 @@
         <w:jc w:val="both"/>
       </w:pPr>
       <w:r>
+        <w:rPr>
+          <w:noProof/>
+        </w:rPr>
         <w:drawing>
           <wp:inline distT="0" distB="0" distL="0" distR="0" wp14:anchorId="26E47621" wp14:editId="183B781A">
             <wp:extent cx="6152515" cy="3883025"/>
@@ -6496,6 +9962,9 @@
         <w:jc w:val="both"/>
       </w:pPr>
       <w:r>
+        <w:rPr>
+          <w:noProof/>
+        </w:rPr>
         <w:drawing>
           <wp:inline distT="0" distB="0" distL="0" distR="0" wp14:anchorId="6210DC9D" wp14:editId="57F6BC70">
             <wp:extent cx="6152515" cy="3850640"/>
@@ -7303,7 +10772,6 @@
   <w:style w:type="character" w:default="1" w:styleId="DefaultParagraphFont">
     <w:name w:val="Default Paragraph Font"/>
     <w:uiPriority w:val="1"/>
-    <w:semiHidden/>
     <w:unhideWhenUsed/>
   </w:style>
   <w:style w:type="table" w:default="1" w:styleId="TableNormal">
@@ -7460,6 +10928,109 @@
     <w:link w:val="Footer"/>
     <w:uiPriority w:val="99"/>
     <w:rsid w:val="00B1083B"/>
+  </w:style>
+  <w:style w:type="table" w:styleId="GridTable5Dark-Accent1">
+    <w:name w:val="Grid Table 5 Dark Accent 1"/>
+    <w:basedOn w:val="TableNormal"/>
+    <w:uiPriority w:val="50"/>
+    <w:rsid w:val="003F01E8"/>
+    <w:tblPr>
+      <w:tblStyleRowBandSize w:val="1"/>
+      <w:tblStyleColBandSize w:val="1"/>
+      <w:tblBorders>
+        <w:top w:val="single" w:sz="4" w:space="0" w:color="FFFFFF" w:themeColor="background1"/>
+        <w:left w:val="single" w:sz="4" w:space="0" w:color="FFFFFF" w:themeColor="background1"/>
+        <w:bottom w:val="single" w:sz="4" w:space="0" w:color="FFFFFF" w:themeColor="background1"/>
+        <w:right w:val="single" w:sz="4" w:space="0" w:color="FFFFFF" w:themeColor="background1"/>
+        <w:insideH w:val="single" w:sz="4" w:space="0" w:color="FFFFFF" w:themeColor="background1"/>
+        <w:insideV w:val="single" w:sz="4" w:space="0" w:color="FFFFFF" w:themeColor="background1"/>
+      </w:tblBorders>
+    </w:tblPr>
+    <w:tcPr>
+      <w:shd w:val="clear" w:color="auto" w:fill="D9E2F3" w:themeFill="accent1" w:themeFillTint="33"/>
+    </w:tcPr>
+    <w:tblStylePr w:type="firstRow">
+      <w:rPr>
+        <w:b/>
+        <w:bCs/>
+        <w:color w:val="FFFFFF" w:themeColor="background1"/>
+      </w:rPr>
+      <w:tblPr/>
+      <w:tcPr>
+        <w:tcBorders>
+          <w:top w:val="single" w:sz="4" w:space="0" w:color="FFFFFF" w:themeColor="background1"/>
+          <w:left w:val="single" w:sz="4" w:space="0" w:color="FFFFFF" w:themeColor="background1"/>
+          <w:right w:val="single" w:sz="4" w:space="0" w:color="FFFFFF" w:themeColor="background1"/>
+          <w:insideH w:val="nil"/>
+          <w:insideV w:val="nil"/>
+        </w:tcBorders>
+        <w:shd w:val="clear" w:color="auto" w:fill="4472C4" w:themeFill="accent1"/>
+      </w:tcPr>
+    </w:tblStylePr>
+    <w:tblStylePr w:type="lastRow">
+      <w:rPr>
+        <w:b/>
+        <w:bCs/>
+        <w:color w:val="FFFFFF" w:themeColor="background1"/>
+      </w:rPr>
+      <w:tblPr/>
+      <w:tcPr>
+        <w:tcBorders>
+          <w:left w:val="single" w:sz="4" w:space="0" w:color="FFFFFF" w:themeColor="background1"/>
+          <w:bottom w:val="single" w:sz="4" w:space="0" w:color="FFFFFF" w:themeColor="background1"/>
+          <w:right w:val="single" w:sz="4" w:space="0" w:color="FFFFFF" w:themeColor="background1"/>
+          <w:insideH w:val="nil"/>
+          <w:insideV w:val="nil"/>
+        </w:tcBorders>
+        <w:shd w:val="clear" w:color="auto" w:fill="4472C4" w:themeFill="accent1"/>
+      </w:tcPr>
+    </w:tblStylePr>
+    <w:tblStylePr w:type="firstCol">
+      <w:rPr>
+        <w:b/>
+        <w:bCs/>
+        <w:color w:val="FFFFFF" w:themeColor="background1"/>
+      </w:rPr>
+      <w:tblPr/>
+      <w:tcPr>
+        <w:tcBorders>
+          <w:top w:val="single" w:sz="4" w:space="0" w:color="FFFFFF" w:themeColor="background1"/>
+          <w:left w:val="single" w:sz="4" w:space="0" w:color="FFFFFF" w:themeColor="background1"/>
+          <w:bottom w:val="single" w:sz="4" w:space="0" w:color="FFFFFF" w:themeColor="background1"/>
+          <w:insideV w:val="nil"/>
+        </w:tcBorders>
+        <w:shd w:val="clear" w:color="auto" w:fill="4472C4" w:themeFill="accent1"/>
+      </w:tcPr>
+    </w:tblStylePr>
+    <w:tblStylePr w:type="lastCol">
+      <w:rPr>
+        <w:b/>
+        <w:bCs/>
+        <w:color w:val="FFFFFF" w:themeColor="background1"/>
+      </w:rPr>
+      <w:tblPr/>
+      <w:tcPr>
+        <w:tcBorders>
+          <w:top w:val="single" w:sz="4" w:space="0" w:color="FFFFFF" w:themeColor="background1"/>
+          <w:bottom w:val="single" w:sz="4" w:space="0" w:color="FFFFFF" w:themeColor="background1"/>
+          <w:right w:val="single" w:sz="4" w:space="0" w:color="FFFFFF" w:themeColor="background1"/>
+          <w:insideV w:val="nil"/>
+        </w:tcBorders>
+        <w:shd w:val="clear" w:color="auto" w:fill="4472C4" w:themeFill="accent1"/>
+      </w:tcPr>
+    </w:tblStylePr>
+    <w:tblStylePr w:type="band1Vert">
+      <w:tblPr/>
+      <w:tcPr>
+        <w:shd w:val="clear" w:color="auto" w:fill="B4C6E7" w:themeFill="accent1" w:themeFillTint="66"/>
+      </w:tcPr>
+    </w:tblStylePr>
+    <w:tblStylePr w:type="band1Horz">
+      <w:tblPr/>
+      <w:tcPr>
+        <w:shd w:val="clear" w:color="auto" w:fill="B4C6E7" w:themeFill="accent1" w:themeFillTint="66"/>
+      </w:tcPr>
+    </w:tblStylePr>
   </w:style>
 </w:styles>
 </file>

</xml_diff>